<commit_message>
work on report and updated installation/build in readme
</commit_message>
<xml_diff>
--- a/ProjectReport.docx
+++ b/ProjectReport.docx
@@ -26,7 +26,21 @@
             <w:rStyle w:val="Hyperlink"/>
             <w:rFonts w:ascii="Times New Roman" w:hAnsi="Times New Roman" w:cs="Times New Roman"/>
           </w:rPr>
-          <w:t>https://github.com/IgnacioLY9/CS5833Project/</w:t>
+          <w:t>https://github.com/Ignac</w:t>
+        </w:r>
+        <w:r>
+          <w:rPr>
+            <w:rStyle w:val="Hyperlink"/>
+            <w:rFonts w:ascii="Times New Roman" w:hAnsi="Times New Roman" w:cs="Times New Roman"/>
+          </w:rPr>
+          <w:t>i</w:t>
+        </w:r>
+        <w:r>
+          <w:rPr>
+            <w:rStyle w:val="Hyperlink"/>
+            <w:rFonts w:ascii="Times New Roman" w:hAnsi="Times New Roman" w:cs="Times New Roman"/>
+          </w:rPr>
+          <w:t>oLY9/CS5833Project/</w:t>
         </w:r>
       </w:hyperlink>
     </w:p>
@@ -80,13 +94,11 @@
       <w:pPr>
         <w:rPr>
           <w:rFonts w:ascii="Times New Roman" w:hAnsi="Times New Roman" w:cs="Times New Roman"/>
-          <w:lang w:val="es-ES"/>
-        </w:rPr>
-      </w:pPr>
-      <w:r>
-        <w:rPr>
-          <w:rFonts w:ascii="Times New Roman" w:hAnsi="Times New Roman" w:cs="Times New Roman"/>
-          <w:lang w:val="es-ES"/>
+        </w:rPr>
+      </w:pPr>
+      <w:r>
+        <w:rPr>
+          <w:rFonts w:ascii="Times New Roman" w:hAnsi="Times New Roman" w:cs="Times New Roman"/>
         </w:rPr>
         <w:t xml:space="preserve">Ignacio Yockers, 113498513, </w:t>
       </w:r>
@@ -95,7 +107,6 @@
           <w:rPr>
             <w:rStyle w:val="Hyperlink"/>
             <w:rFonts w:ascii="Times New Roman" w:hAnsi="Times New Roman" w:cs="Times New Roman"/>
-            <w:lang w:val="es-ES"/>
           </w:rPr>
           <w:t>Ignacio.l.yockers-1@ou.edu</w:t>
         </w:r>
@@ -130,15 +141,28 @@
     </w:p>
     <w:p>
       <w:pPr>
-        <w:rPr>
-          <w:rFonts w:ascii="Times New Roman" w:hAnsi="Times New Roman" w:cs="Times New Roman"/>
-        </w:rPr>
-      </w:pPr>
-      <w:r>
-        <w:rPr>
-          <w:rFonts w:ascii="Times New Roman" w:hAnsi="Times New Roman" w:cs="Times New Roman"/>
-        </w:rPr>
-        <w:t xml:space="preserve">The goal of this project was to </w:t>
+        <w:ind w:firstLine="720"/>
+        <w:rPr>
+          <w:rFonts w:ascii="Times New Roman" w:hAnsi="Times New Roman" w:cs="Times New Roman"/>
+        </w:rPr>
+      </w:pPr>
+      <w:r>
+        <w:rPr>
+          <w:rFonts w:ascii="Times New Roman" w:hAnsi="Times New Roman" w:cs="Times New Roman"/>
+        </w:rPr>
+        <w:t>The</w:t>
+      </w:r>
+      <w:r>
+        <w:rPr>
+          <w:rFonts w:ascii="Times New Roman" w:hAnsi="Times New Roman" w:cs="Times New Roman"/>
+        </w:rPr>
+        <w:t xml:space="preserve"> purpose</w:t>
+      </w:r>
+      <w:r>
+        <w:rPr>
+          <w:rFonts w:ascii="Times New Roman" w:hAnsi="Times New Roman" w:cs="Times New Roman"/>
+        </w:rPr>
+        <w:t xml:space="preserve"> of this project was to </w:t>
       </w:r>
       <w:r>
         <w:rPr>
@@ -150,19 +174,181 @@
         <w:rPr>
           <w:rFonts w:ascii="Times New Roman" w:hAnsi="Times New Roman" w:cs="Times New Roman"/>
         </w:rPr>
-        <w:t>Ethereum of Web3 project/application.</w:t>
-      </w:r>
-      <w:r>
-        <w:rPr>
-          <w:rFonts w:ascii="Times New Roman" w:hAnsi="Times New Roman" w:cs="Times New Roman"/>
-        </w:rPr>
-        <w:t xml:space="preserve"> This project improved the Blobscan repository. New API endpoints were added. Documenta</w:t>
-      </w:r>
-      <w:r>
-        <w:rPr>
-          <w:rFonts w:ascii="Times New Roman" w:hAnsi="Times New Roman" w:cs="Times New Roman"/>
-        </w:rPr>
-        <w:t>tion for certain existing endpoints was improved. The installation guide for local use was updated.</w:t>
+        <w:t>Ethereum o</w:t>
+      </w:r>
+      <w:r>
+        <w:rPr>
+          <w:rFonts w:ascii="Times New Roman" w:hAnsi="Times New Roman" w:cs="Times New Roman"/>
+        </w:rPr>
+        <w:t>r</w:t>
+      </w:r>
+      <w:r>
+        <w:rPr>
+          <w:rFonts w:ascii="Times New Roman" w:hAnsi="Times New Roman" w:cs="Times New Roman"/>
+        </w:rPr>
+        <w:t xml:space="preserve"> Web3 project/application.</w:t>
+      </w:r>
+      <w:r>
+        <w:rPr>
+          <w:rFonts w:ascii="Times New Roman" w:hAnsi="Times New Roman" w:cs="Times New Roman"/>
+        </w:rPr>
+        <w:t xml:space="preserve"> </w:t>
+      </w:r>
+      <w:r>
+        <w:rPr>
+          <w:rFonts w:ascii="Times New Roman" w:hAnsi="Times New Roman" w:cs="Times New Roman"/>
+        </w:rPr>
+        <w:t xml:space="preserve">Blobscan is an </w:t>
+      </w:r>
+      <w:proofErr w:type="gramStart"/>
+      <w:r>
+        <w:rPr>
+          <w:rFonts w:ascii="Times New Roman" w:hAnsi="Times New Roman" w:cs="Times New Roman"/>
+        </w:rPr>
+        <w:t>open</w:t>
+      </w:r>
+      <w:r>
+        <w:rPr>
+          <w:rFonts w:ascii="Times New Roman" w:hAnsi="Times New Roman" w:cs="Times New Roman"/>
+        </w:rPr>
+        <w:t>-</w:t>
+      </w:r>
+      <w:r>
+        <w:rPr>
+          <w:rFonts w:ascii="Times New Roman" w:hAnsi="Times New Roman" w:cs="Times New Roman"/>
+        </w:rPr>
+        <w:t>source</w:t>
+      </w:r>
+      <w:proofErr w:type="gramEnd"/>
+      <w:r>
+        <w:rPr>
+          <w:rFonts w:ascii="Times New Roman" w:hAnsi="Times New Roman" w:cs="Times New Roman"/>
+        </w:rPr>
+        <w:t xml:space="preserve"> blockchain explorer that primarily focuses on </w:t>
+      </w:r>
+      <w:r>
+        <w:rPr>
+          <w:rFonts w:ascii="Times New Roman" w:hAnsi="Times New Roman" w:cs="Times New Roman"/>
+        </w:rPr>
+        <w:t xml:space="preserve">Ethereum blobs. </w:t>
+      </w:r>
+      <w:proofErr w:type="spellStart"/>
+      <w:r>
+        <w:rPr>
+          <w:rFonts w:ascii="Times New Roman" w:hAnsi="Times New Roman" w:cs="Times New Roman"/>
+        </w:rPr>
+        <w:t>Blobscan’s</w:t>
+      </w:r>
+      <w:proofErr w:type="spellEnd"/>
+      <w:r>
+        <w:rPr>
+          <w:rFonts w:ascii="Times New Roman" w:hAnsi="Times New Roman" w:cs="Times New Roman"/>
+        </w:rPr>
+        <w:t xml:space="preserve"> public API</w:t>
+      </w:r>
+      <w:r>
+        <w:rPr>
+          <w:rFonts w:ascii="Times New Roman" w:hAnsi="Times New Roman" w:cs="Times New Roman"/>
+        </w:rPr>
+        <w:t xml:space="preserve"> </w:t>
+      </w:r>
+      <w:r>
+        <w:rPr>
+          <w:rFonts w:ascii="Times New Roman" w:hAnsi="Times New Roman" w:cs="Times New Roman"/>
+        </w:rPr>
+        <w:t xml:space="preserve">that </w:t>
+      </w:r>
+      <w:r>
+        <w:rPr>
+          <w:rFonts w:ascii="Times New Roman" w:hAnsi="Times New Roman" w:cs="Times New Roman"/>
+        </w:rPr>
+        <w:t xml:space="preserve">allows users </w:t>
+      </w:r>
+      <w:r>
+        <w:rPr>
+          <w:rFonts w:ascii="Times New Roman" w:hAnsi="Times New Roman" w:cs="Times New Roman"/>
+        </w:rPr>
+        <w:t xml:space="preserve">to </w:t>
+      </w:r>
+      <w:r>
+        <w:rPr>
+          <w:rFonts w:ascii="Times New Roman" w:hAnsi="Times New Roman" w:cs="Times New Roman"/>
+        </w:rPr>
+        <w:t xml:space="preserve">fetch data from </w:t>
+      </w:r>
+      <w:proofErr w:type="spellStart"/>
+      <w:r>
+        <w:rPr>
+          <w:rFonts w:ascii="Times New Roman" w:hAnsi="Times New Roman" w:cs="Times New Roman"/>
+        </w:rPr>
+        <w:t>Blobscan’s</w:t>
+      </w:r>
+      <w:proofErr w:type="spellEnd"/>
+      <w:r>
+        <w:rPr>
+          <w:rFonts w:ascii="Times New Roman" w:hAnsi="Times New Roman" w:cs="Times New Roman"/>
+        </w:rPr>
+        <w:t xml:space="preserve"> database </w:t>
+      </w:r>
+      <w:r>
+        <w:rPr>
+          <w:rFonts w:ascii="Times New Roman" w:hAnsi="Times New Roman" w:cs="Times New Roman"/>
+        </w:rPr>
+        <w:t xml:space="preserve">is not </w:t>
+      </w:r>
+      <w:r>
+        <w:rPr>
+          <w:rFonts w:ascii="Times New Roman" w:hAnsi="Times New Roman" w:cs="Times New Roman"/>
+        </w:rPr>
+        <w:t xml:space="preserve">very developed and lacks good documentation. </w:t>
+      </w:r>
+      <w:r>
+        <w:rPr>
+          <w:rFonts w:ascii="Times New Roman" w:hAnsi="Times New Roman" w:cs="Times New Roman"/>
+        </w:rPr>
+        <w:t>This project improved the Blobscan repository</w:t>
+      </w:r>
+      <w:r>
+        <w:rPr>
+          <w:rFonts w:ascii="Times New Roman" w:hAnsi="Times New Roman" w:cs="Times New Roman"/>
+        </w:rPr>
+        <w:t xml:space="preserve"> by adding</w:t>
+      </w:r>
+      <w:r>
+        <w:rPr>
+          <w:rFonts w:ascii="Times New Roman" w:hAnsi="Times New Roman" w:cs="Times New Roman"/>
+        </w:rPr>
+        <w:t xml:space="preserve"> New API endpoints</w:t>
+      </w:r>
+      <w:r>
+        <w:rPr>
+          <w:rFonts w:ascii="Times New Roman" w:hAnsi="Times New Roman" w:cs="Times New Roman"/>
+        </w:rPr>
+        <w:t xml:space="preserve"> and improving the d</w:t>
+      </w:r>
+      <w:r>
+        <w:rPr>
+          <w:rFonts w:ascii="Times New Roman" w:hAnsi="Times New Roman" w:cs="Times New Roman"/>
+        </w:rPr>
+        <w:t>ocumenta</w:t>
+      </w:r>
+      <w:r>
+        <w:rPr>
+          <w:rFonts w:ascii="Times New Roman" w:hAnsi="Times New Roman" w:cs="Times New Roman"/>
+        </w:rPr>
+        <w:t xml:space="preserve">tion for certain existing endpoints. </w:t>
+      </w:r>
+      <w:r>
+        <w:rPr>
+          <w:rFonts w:ascii="Times New Roman" w:hAnsi="Times New Roman" w:cs="Times New Roman"/>
+        </w:rPr>
+        <w:t>Additionally, t</w:t>
+      </w:r>
+      <w:r>
+        <w:rPr>
+          <w:rFonts w:ascii="Times New Roman" w:hAnsi="Times New Roman" w:cs="Times New Roman"/>
+        </w:rPr>
+        <w:t>he installation guide for local use was updated.</w:t>
       </w:r>
     </w:p>
     <w:p>
@@ -189,26 +375,94 @@
         <w:rPr>
           <w:rFonts w:ascii="Times New Roman" w:hAnsi="Times New Roman" w:cs="Times New Roman"/>
         </w:rPr>
-        <w:t>What is a blob?</w:t>
-      </w:r>
-    </w:p>
-    <w:p>
-      <w:pPr>
-        <w:rPr>
-          <w:rFonts w:ascii="Times New Roman" w:hAnsi="Times New Roman" w:cs="Times New Roman"/>
-        </w:rPr>
-      </w:pPr>
-      <w:r>
-        <w:rPr>
-          <w:rFonts w:ascii="Times New Roman" w:hAnsi="Times New Roman" w:cs="Times New Roman"/>
-        </w:rPr>
         <w:tab/>
-      </w:r>
-      <w:r>
-        <w:rPr>
-          <w:rFonts w:ascii="Times New Roman" w:hAnsi="Times New Roman" w:cs="Times New Roman"/>
-        </w:rPr>
-        <w:t xml:space="preserve">It is a way of scaling the Ethereum blockchain. </w:t>
+        <w:t xml:space="preserve">A blob </w:t>
+      </w:r>
+      <w:r>
+        <w:rPr>
+          <w:rFonts w:ascii="Times New Roman" w:hAnsi="Times New Roman" w:cs="Times New Roman"/>
+        </w:rPr>
+        <w:t xml:space="preserve">is </w:t>
+      </w:r>
+      <w:r>
+        <w:rPr>
+          <w:rFonts w:ascii="Times New Roman" w:hAnsi="Times New Roman" w:cs="Times New Roman"/>
+        </w:rPr>
+        <w:t xml:space="preserve">an Ethereum data type that allows for short term storage of data. </w:t>
+      </w:r>
+      <w:r>
+        <w:rPr>
+          <w:rFonts w:ascii="Times New Roman" w:hAnsi="Times New Roman" w:cs="Times New Roman"/>
+        </w:rPr>
+        <w:t xml:space="preserve">Blobs were introduced into the Ethereum blockchain </w:t>
+      </w:r>
+      <w:proofErr w:type="gramStart"/>
+      <w:r>
+        <w:rPr>
+          <w:rFonts w:ascii="Times New Roman" w:hAnsi="Times New Roman" w:cs="Times New Roman"/>
+        </w:rPr>
+        <w:t>in order to</w:t>
+      </w:r>
+      <w:proofErr w:type="gramEnd"/>
+      <w:r>
+        <w:rPr>
+          <w:rFonts w:ascii="Times New Roman" w:hAnsi="Times New Roman" w:cs="Times New Roman"/>
+        </w:rPr>
+        <w:t xml:space="preserve"> increase scalability. </w:t>
+      </w:r>
+      <w:r>
+        <w:rPr>
+          <w:rFonts w:ascii="Times New Roman" w:hAnsi="Times New Roman" w:cs="Times New Roman"/>
+        </w:rPr>
+        <w:t xml:space="preserve">Their data and transactions </w:t>
+      </w:r>
+      <w:r>
+        <w:rPr>
+          <w:rFonts w:ascii="Times New Roman" w:hAnsi="Times New Roman" w:cs="Times New Roman"/>
+        </w:rPr>
+        <w:t>cannot</w:t>
+      </w:r>
+      <w:r>
+        <w:rPr>
+          <w:rFonts w:ascii="Times New Roman" w:hAnsi="Times New Roman" w:cs="Times New Roman"/>
+        </w:rPr>
+        <w:t xml:space="preserve"> be accessed by the Ethereum Virtual Machine, but they are still included in the consensus. Because they are meant for short term storage, their data can safely be deleted after a short period of time</w:t>
+      </w:r>
+      <w:r>
+        <w:rPr>
+          <w:rFonts w:ascii="Times New Roman" w:hAnsi="Times New Roman" w:cs="Times New Roman"/>
+        </w:rPr>
+        <w:t xml:space="preserve"> [1]</w:t>
+      </w:r>
+      <w:r>
+        <w:rPr>
+          <w:rFonts w:ascii="Times New Roman" w:hAnsi="Times New Roman" w:cs="Times New Roman"/>
+        </w:rPr>
+        <w:t xml:space="preserve">. </w:t>
+      </w:r>
+      <w:r>
+        <w:rPr>
+          <w:rFonts w:ascii="Times New Roman" w:hAnsi="Times New Roman" w:cs="Times New Roman"/>
+        </w:rPr>
+        <w:t xml:space="preserve">Because </w:t>
+      </w:r>
+      <w:r>
+        <w:rPr>
+          <w:rFonts w:ascii="Times New Roman" w:hAnsi="Times New Roman" w:cs="Times New Roman"/>
+        </w:rPr>
+        <w:t xml:space="preserve">users now have better ways of publishing the data associated with a rollup, rather than permanently storing it in the L1 chain, </w:t>
+      </w:r>
+      <w:r>
+        <w:rPr>
+          <w:rFonts w:ascii="Times New Roman" w:hAnsi="Times New Roman" w:cs="Times New Roman"/>
+        </w:rPr>
+        <w:t>users ca</w:t>
+      </w:r>
+      <w:r>
+        <w:rPr>
+          <w:rFonts w:ascii="Times New Roman" w:hAnsi="Times New Roman" w:cs="Times New Roman"/>
+        </w:rPr>
+        <w:t>n pay less in gas fees.</w:t>
       </w:r>
     </w:p>
     <w:p>
@@ -222,118 +476,57 @@
           <w:rFonts w:ascii="Times New Roman" w:hAnsi="Times New Roman" w:cs="Times New Roman"/>
         </w:rPr>
         <w:tab/>
-        <w:t>The</w:t>
-      </w:r>
-      <w:r>
-        <w:rPr>
-          <w:rFonts w:ascii="Times New Roman" w:hAnsi="Times New Roman" w:cs="Times New Roman"/>
-        </w:rPr>
-        <w:t>y carry data and transactions that can not be accessed by the EVM, but they are still included in the consensus of the chain.</w:t>
-      </w:r>
-    </w:p>
-    <w:p>
-      <w:pPr>
-        <w:rPr>
-          <w:rFonts w:ascii="Times New Roman" w:hAnsi="Times New Roman" w:cs="Times New Roman"/>
-        </w:rPr>
-      </w:pPr>
-      <w:r>
-        <w:rPr>
-          <w:rFonts w:ascii="Times New Roman" w:hAnsi="Times New Roman" w:cs="Times New Roman"/>
-        </w:rPr>
-        <w:tab/>
-        <w:t xml:space="preserve">They are meant to be </w:t>
-      </w:r>
-      <w:r>
-        <w:rPr>
-          <w:rFonts w:ascii="Times New Roman" w:hAnsi="Times New Roman" w:cs="Times New Roman"/>
-        </w:rPr>
-        <w:t>a sort of short term storage and they can be safely deleted after a brief amount of time.</w:t>
-      </w:r>
-    </w:p>
-    <w:p>
-      <w:pPr>
-        <w:rPr>
-          <w:rFonts w:ascii="Times New Roman" w:hAnsi="Times New Roman" w:cs="Times New Roman"/>
-        </w:rPr>
-      </w:pPr>
-      <w:r>
-        <w:rPr>
-          <w:rFonts w:ascii="Times New Roman" w:hAnsi="Times New Roman" w:cs="Times New Roman"/>
-        </w:rPr>
-        <w:t>Why would the Ethereum blockchain want blobs</w:t>
-      </w:r>
-      <w:r>
-        <w:rPr>
-          <w:rFonts w:ascii="Times New Roman" w:hAnsi="Times New Roman" w:cs="Times New Roman"/>
-        </w:rPr>
-        <w:t>?</w:t>
-      </w:r>
-    </w:p>
-    <w:p>
-      <w:pPr>
-        <w:rPr>
-          <w:rFonts w:ascii="Times New Roman" w:hAnsi="Times New Roman" w:cs="Times New Roman"/>
-        </w:rPr>
-      </w:pPr>
-      <w:r>
-        <w:rPr>
-          <w:rFonts w:ascii="Times New Roman" w:hAnsi="Times New Roman" w:cs="Times New Roman"/>
-        </w:rPr>
-        <w:tab/>
-        <w:t xml:space="preserve">Allows for more </w:t>
-      </w:r>
-      <w:r>
-        <w:rPr>
-          <w:rFonts w:ascii="Times New Roman" w:hAnsi="Times New Roman" w:cs="Times New Roman"/>
-        </w:rPr>
-        <w:t>transactions to be performed off-chain. This reduces the load on the main block chain and reduces gas prices for users.</w:t>
-      </w:r>
-    </w:p>
-    <w:p>
-      <w:pPr>
-        <w:rPr>
-          <w:rFonts w:ascii="Times New Roman" w:hAnsi="Times New Roman" w:cs="Times New Roman"/>
-        </w:rPr>
-      </w:pPr>
-      <w:r>
-        <w:rPr>
-          <w:rFonts w:ascii="Times New Roman" w:hAnsi="Times New Roman" w:cs="Times New Roman"/>
-        </w:rPr>
-        <w:t>Why is Blobscan important. Why should it be contributed to as a repository?</w:t>
-      </w:r>
-    </w:p>
-    <w:p>
-      <w:pPr>
-        <w:rPr>
-          <w:rFonts w:ascii="Times New Roman" w:hAnsi="Times New Roman" w:cs="Times New Roman"/>
-        </w:rPr>
-      </w:pPr>
-      <w:r>
-        <w:rPr>
-          <w:rFonts w:ascii="Times New Roman" w:hAnsi="Times New Roman" w:cs="Times New Roman"/>
-        </w:rPr>
-        <w:tab/>
-      </w:r>
-      <w:r>
-        <w:rPr>
-          <w:rFonts w:ascii="Times New Roman" w:hAnsi="Times New Roman" w:cs="Times New Roman"/>
-        </w:rPr>
-        <w:t>It gives users the ability to focus primarily on blobs. Using Blobscan, users and developers can more easily look at real-time, or historical, information about blobs on the Ethereum blockchain to better estimate gas prices.</w:t>
-      </w:r>
-    </w:p>
-    <w:p>
-      <w:pPr>
-        <w:rPr>
-          <w:rFonts w:ascii="Times New Roman" w:hAnsi="Times New Roman" w:cs="Times New Roman"/>
-        </w:rPr>
-      </w:pPr>
-      <w:r>
-        <w:rPr>
-          <w:rFonts w:ascii="Times New Roman" w:hAnsi="Times New Roman" w:cs="Times New Roman"/>
-        </w:rPr>
-        <w:tab/>
-        <w:t>It provides users with an API they can use to directly query information they would like about blobs.</w:t>
+        <w:t xml:space="preserve">Because of the utility of blobs for the Ethereum blockchain, </w:t>
+      </w:r>
+      <w:r>
+        <w:rPr>
+          <w:rFonts w:ascii="Times New Roman" w:hAnsi="Times New Roman" w:cs="Times New Roman"/>
+        </w:rPr>
+        <w:t xml:space="preserve">the blockchain explorer Blobscan is important. Blobscan, unlike other blockchain explorers, </w:t>
+      </w:r>
+      <w:r>
+        <w:rPr>
+          <w:rFonts w:ascii="Times New Roman" w:hAnsi="Times New Roman" w:cs="Times New Roman"/>
+        </w:rPr>
+        <w:t xml:space="preserve">focuses primarily on blobs. Using Blobscan, Ethereum users and developers can easily look at </w:t>
+      </w:r>
+      <w:r>
+        <w:rPr>
+          <w:rFonts w:ascii="Times New Roman" w:hAnsi="Times New Roman" w:cs="Times New Roman"/>
+        </w:rPr>
+        <w:t>information about blobs, their associated gas prices, and the transactions they contain.</w:t>
+      </w:r>
+      <w:r>
+        <w:rPr>
+          <w:rFonts w:ascii="Times New Roman" w:hAnsi="Times New Roman" w:cs="Times New Roman"/>
+        </w:rPr>
+        <w:t xml:space="preserve"> Additionally, Blobscan provides users with a public API that can be used to directly query information from the Blobscan database about </w:t>
+      </w:r>
+      <w:r>
+        <w:rPr>
+          <w:rFonts w:ascii="Times New Roman" w:hAnsi="Times New Roman" w:cs="Times New Roman"/>
+        </w:rPr>
+        <w:t xml:space="preserve">Ethereum blobs. However, </w:t>
+      </w:r>
+      <w:proofErr w:type="spellStart"/>
+      <w:r>
+        <w:rPr>
+          <w:rFonts w:ascii="Times New Roman" w:hAnsi="Times New Roman" w:cs="Times New Roman"/>
+        </w:rPr>
+        <w:t>Blobscan’s</w:t>
+      </w:r>
+      <w:proofErr w:type="spellEnd"/>
+      <w:r>
+        <w:rPr>
+          <w:rFonts w:ascii="Times New Roman" w:hAnsi="Times New Roman" w:cs="Times New Roman"/>
+        </w:rPr>
+        <w:t xml:space="preserve"> API is </w:t>
+      </w:r>
+      <w:r>
+        <w:rPr>
+          <w:rFonts w:ascii="Times New Roman" w:hAnsi="Times New Roman" w:cs="Times New Roman"/>
+        </w:rPr>
+        <w:t>very rudimentary. This project aims to contribute to the Blobscan API.</w:t>
       </w:r>
     </w:p>
     <w:p>
@@ -358,134 +551,761 @@
       </w:r>
     </w:p>
     <w:p>
-      <w:r>
-        <w:t xml:space="preserve">The Blobscan API is limited. Some users expressed </w:t>
-      </w:r>
-      <w:r>
-        <w:t>disappointment. To contribute to this repository, new API endpoints were added.</w:t>
-      </w:r>
-    </w:p>
-    <w:p>
-      <w:r>
-        <w:t>Additionally, there are “issues” with the API endpoints only because of a lack of documentation.</w:t>
-      </w:r>
-    </w:p>
-    <w:p>
-      <w:r>
-        <w:t xml:space="preserve">New API endpoints were added along with </w:t>
-      </w:r>
-      <w:r>
-        <w:t>corresponding test files.</w:t>
-      </w:r>
-    </w:p>
-    <w:p>
-      <w:r>
-        <w:t xml:space="preserve">Getgassummary. </w:t>
-      </w:r>
-    </w:p>
-    <w:p>
-      <w:r>
+      <w:pPr>
+        <w:rPr>
+          <w:rFonts w:ascii="Times New Roman" w:hAnsi="Times New Roman" w:cs="Times New Roman"/>
+        </w:rPr>
+      </w:pPr>
+      <w:r>
+        <w:rPr>
+          <w:rFonts w:ascii="Times New Roman" w:hAnsi="Times New Roman" w:cs="Times New Roman"/>
+        </w:rPr>
+        <w:tab/>
+        <w:t xml:space="preserve">On </w:t>
+      </w:r>
+      <w:proofErr w:type="spellStart"/>
+      <w:r>
+        <w:rPr>
+          <w:rFonts w:ascii="Times New Roman" w:hAnsi="Times New Roman" w:cs="Times New Roman"/>
+        </w:rPr>
+        <w:t>Blobscan’s</w:t>
+      </w:r>
+      <w:proofErr w:type="spellEnd"/>
+      <w:r>
+        <w:rPr>
+          <w:rFonts w:ascii="Times New Roman" w:hAnsi="Times New Roman" w:cs="Times New Roman"/>
+        </w:rPr>
+        <w:t xml:space="preserve"> GitHub repository</w:t>
+      </w:r>
+      <w:r>
+        <w:rPr>
+          <w:rFonts w:ascii="Times New Roman" w:hAnsi="Times New Roman" w:cs="Times New Roman"/>
+        </w:rPr>
+        <w:t xml:space="preserve"> (</w:t>
+      </w:r>
+      <w:hyperlink r:id="rId9" w:history="1">
+        <w:r>
+          <w:rPr>
+            <w:rStyle w:val="Hyperlink"/>
+            <w:rFonts w:ascii="Times New Roman" w:hAnsi="Times New Roman" w:cs="Times New Roman"/>
+          </w:rPr>
+          <w:t>https://github.com/Blobscan/blobscan</w:t>
+        </w:r>
+      </w:hyperlink>
+      <w:r>
+        <w:rPr>
+          <w:rFonts w:ascii="Times New Roman" w:hAnsi="Times New Roman" w:cs="Times New Roman"/>
+        </w:rPr>
+        <w:t>)</w:t>
+      </w:r>
+      <w:r>
+        <w:rPr>
+          <w:rFonts w:ascii="Times New Roman" w:hAnsi="Times New Roman" w:cs="Times New Roman"/>
+        </w:rPr>
+        <w:t xml:space="preserve">, some users expressed disappointment </w:t>
+      </w:r>
+      <w:r>
+        <w:rPr>
+          <w:rFonts w:ascii="Times New Roman" w:hAnsi="Times New Roman" w:cs="Times New Roman"/>
+        </w:rPr>
+        <w:t xml:space="preserve">because of Blobscan API’s limitations. </w:t>
+      </w:r>
+      <w:r>
+        <w:rPr>
+          <w:rFonts w:ascii="Times New Roman" w:hAnsi="Times New Roman" w:cs="Times New Roman"/>
+        </w:rPr>
+        <w:t xml:space="preserve">Some of the complaints regarding how endpoints functioned </w:t>
+      </w:r>
+      <w:r>
+        <w:rPr>
+          <w:rFonts w:ascii="Times New Roman" w:hAnsi="Times New Roman" w:cs="Times New Roman"/>
+        </w:rPr>
+        <w:t>were</w:t>
+      </w:r>
+      <w:r>
+        <w:rPr>
+          <w:rFonts w:ascii="Times New Roman" w:hAnsi="Times New Roman" w:cs="Times New Roman"/>
+        </w:rPr>
+        <w:t xml:space="preserve"> entirely due to </w:t>
+      </w:r>
+      <w:r>
+        <w:rPr>
+          <w:rFonts w:ascii="Times New Roman" w:hAnsi="Times New Roman" w:cs="Times New Roman"/>
+        </w:rPr>
+        <w:t xml:space="preserve">a lack of documentation on the API page. The endpoints behaved exactly as designed, but the users didn’t know that. </w:t>
+      </w:r>
+      <w:proofErr w:type="gramStart"/>
+      <w:r>
+        <w:rPr>
+          <w:rFonts w:ascii="Times New Roman" w:hAnsi="Times New Roman" w:cs="Times New Roman"/>
+        </w:rPr>
+        <w:t>In order to</w:t>
+      </w:r>
+      <w:proofErr w:type="gramEnd"/>
+      <w:r>
+        <w:rPr>
+          <w:rFonts w:ascii="Times New Roman" w:hAnsi="Times New Roman" w:cs="Times New Roman"/>
+        </w:rPr>
+        <w:t xml:space="preserve"> </w:t>
+      </w:r>
+      <w:r>
+        <w:rPr>
+          <w:rFonts w:ascii="Times New Roman" w:hAnsi="Times New Roman" w:cs="Times New Roman"/>
+        </w:rPr>
+        <w:t xml:space="preserve">contribute to this repository, </w:t>
+      </w:r>
+      <w:proofErr w:type="spellStart"/>
+      <w:r>
+        <w:rPr>
+          <w:rFonts w:ascii="Times New Roman" w:hAnsi="Times New Roman" w:cs="Times New Roman"/>
+        </w:rPr>
+        <w:t>Quicknode</w:t>
+      </w:r>
+      <w:proofErr w:type="spellEnd"/>
+      <w:r>
+        <w:rPr>
+          <w:rFonts w:ascii="Times New Roman" w:hAnsi="Times New Roman" w:cs="Times New Roman"/>
+        </w:rPr>
+        <w:t xml:space="preserve"> was used to connect to the Sepolia test network. </w:t>
+      </w:r>
+      <w:r>
+        <w:rPr>
+          <w:rFonts w:ascii="Times New Roman" w:hAnsi="Times New Roman" w:cs="Times New Roman"/>
+        </w:rPr>
+        <w:t>Endpoints were created following the OpenAPI framework which allows the Blobscan API page buil</w:t>
+      </w:r>
+      <w:r>
+        <w:rPr>
+          <w:rFonts w:ascii="Times New Roman" w:hAnsi="Times New Roman" w:cs="Times New Roman"/>
+        </w:rPr>
+        <w:t>t</w:t>
+      </w:r>
+      <w:r>
+        <w:rPr>
+          <w:rFonts w:ascii="Times New Roman" w:hAnsi="Times New Roman" w:cs="Times New Roman"/>
+        </w:rPr>
+        <w:t xml:space="preserve"> using Express and Swagger to automatically </w:t>
+      </w:r>
+      <w:r>
+        <w:rPr>
+          <w:rFonts w:ascii="Times New Roman" w:hAnsi="Times New Roman" w:cs="Times New Roman"/>
+        </w:rPr>
+        <w:t xml:space="preserve">build documentation of the endpoint and allow users to use the endpoint. </w:t>
+      </w:r>
+      <w:r>
+        <w:rPr>
+          <w:rFonts w:ascii="Times New Roman" w:hAnsi="Times New Roman" w:cs="Times New Roman"/>
+        </w:rPr>
+        <w:t xml:space="preserve">The following methods and their test files were added to the repository </w:t>
+      </w:r>
+      <w:proofErr w:type="gramStart"/>
+      <w:r>
+        <w:rPr>
+          <w:rFonts w:ascii="Times New Roman" w:hAnsi="Times New Roman" w:cs="Times New Roman"/>
+        </w:rPr>
+        <w:t>in order to</w:t>
+      </w:r>
+      <w:proofErr w:type="gramEnd"/>
+      <w:r>
+        <w:rPr>
+          <w:rFonts w:ascii="Times New Roman" w:hAnsi="Times New Roman" w:cs="Times New Roman"/>
+        </w:rPr>
+        <w:t xml:space="preserve"> improve the API:</w:t>
+      </w:r>
+    </w:p>
+    <w:p>
+      <w:pPr>
+        <w:pStyle w:val="Heading3"/>
+        <w:rPr>
+          <w:rFonts w:ascii="Times New Roman" w:hAnsi="Times New Roman" w:cs="Times New Roman"/>
+        </w:rPr>
+      </w:pPr>
+      <w:r>
+        <w:rPr>
+          <w:rFonts w:ascii="Times New Roman" w:hAnsi="Times New Roman" w:cs="Times New Roman"/>
+        </w:rPr>
+        <w:t>Gas Price Summary</w:t>
+      </w:r>
+    </w:p>
+    <w:p>
+      <w:pPr>
+        <w:rPr>
+          <w:rFonts w:ascii="Times New Roman" w:hAnsi="Times New Roman" w:cs="Times New Roman"/>
+        </w:rPr>
+      </w:pPr>
+      <w:r>
+        <w:rPr>
+          <w:rFonts w:ascii="Times New Roman" w:hAnsi="Times New Roman" w:cs="Times New Roman"/>
+        </w:rPr>
         <w:tab/>
         <w:t xml:space="preserve">Originally, users were only able to query information about </w:t>
       </w:r>
       <w:r>
-        <w:t>avg blob gas prices.</w:t>
-      </w:r>
-      <w:r>
-        <w:t xml:space="preserve"> A user would not be able to directly query additional information about the distribution of gas prices. </w:t>
-      </w:r>
-    </w:p>
-    <w:p>
-      <w:r>
-        <w:tab/>
+        <w:rPr>
+          <w:rFonts w:ascii="Times New Roman" w:hAnsi="Times New Roman" w:cs="Times New Roman"/>
+        </w:rPr>
+        <w:t xml:space="preserve">average </w:t>
+      </w:r>
+      <w:r>
+        <w:rPr>
+          <w:rFonts w:ascii="Times New Roman" w:hAnsi="Times New Roman" w:cs="Times New Roman"/>
+        </w:rPr>
+        <w:t>blob gas prices.</w:t>
+      </w:r>
+      <w:r>
+        <w:rPr>
+          <w:rFonts w:ascii="Times New Roman" w:hAnsi="Times New Roman" w:cs="Times New Roman"/>
+        </w:rPr>
+        <w:t xml:space="preserve"> A user would not be able to directly query additional information about the distribution of gas prices.</w:t>
+      </w:r>
+      <w:r>
+        <w:rPr>
+          <w:rFonts w:ascii="Times New Roman" w:hAnsi="Times New Roman" w:cs="Times New Roman"/>
+        </w:rPr>
+        <w:t xml:space="preserve"> </w:t>
+      </w:r>
+      <w:r>
+        <w:rPr>
+          <w:rFonts w:ascii="Times New Roman" w:hAnsi="Times New Roman" w:cs="Times New Roman"/>
+        </w:rPr>
         <w:t>The Blobscan repository keeps</w:t>
       </w:r>
       <w:r>
+        <w:rPr>
+          <w:rFonts w:ascii="Times New Roman" w:hAnsi="Times New Roman" w:cs="Times New Roman"/>
+        </w:rPr>
         <w:t xml:space="preserve"> track of some overall statistics about blobs. These statistics are updated every 15 minutes and stored in the </w:t>
       </w:r>
       <w:r>
+        <w:rPr>
+          <w:rFonts w:ascii="Times New Roman" w:hAnsi="Times New Roman" w:cs="Times New Roman"/>
+        </w:rPr>
         <w:t xml:space="preserve">database. Whenever a user wants to see the overall statistics, the API fetches the results from the table in the database. </w:t>
       </w:r>
-    </w:p>
-    <w:p>
-      <w:r>
-        <w:tab/>
-        <w:t xml:space="preserve">Added a 5 number summary. I implemented this by adding a new table in the database to store </w:t>
-      </w:r>
-      <w:r>
-        <w:t xml:space="preserve">the summary. Just like the original table, it is updated every 15 minutes and the entries are returned to the user </w:t>
-      </w:r>
-      <w:r>
+      <w:r>
+        <w:rPr>
+          <w:rFonts w:ascii="Times New Roman" w:hAnsi="Times New Roman" w:cs="Times New Roman"/>
+        </w:rPr>
+        <w:t xml:space="preserve">This </w:t>
+      </w:r>
+      <w:r>
+        <w:rPr>
+          <w:rFonts w:ascii="Times New Roman" w:hAnsi="Times New Roman" w:cs="Times New Roman"/>
+        </w:rPr>
+        <w:t xml:space="preserve">new </w:t>
+      </w:r>
+      <w:r>
+        <w:rPr>
+          <w:rFonts w:ascii="Times New Roman" w:hAnsi="Times New Roman" w:cs="Times New Roman"/>
+        </w:rPr>
+        <w:t>API endpoint allows users to retrieve a 5</w:t>
+      </w:r>
+      <w:r>
+        <w:rPr>
+          <w:rFonts w:ascii="Times New Roman" w:hAnsi="Times New Roman" w:cs="Times New Roman"/>
+        </w:rPr>
+        <w:t xml:space="preserve"> number summary</w:t>
+      </w:r>
+      <w:r>
+        <w:rPr>
+          <w:rFonts w:ascii="Times New Roman" w:hAnsi="Times New Roman" w:cs="Times New Roman"/>
+        </w:rPr>
+        <w:t xml:space="preserve"> about the distribution of blob gas prices</w:t>
+      </w:r>
+      <w:r>
+        <w:rPr>
+          <w:rFonts w:ascii="Times New Roman" w:hAnsi="Times New Roman" w:cs="Times New Roman"/>
+        </w:rPr>
+        <w:t xml:space="preserve">. </w:t>
+      </w:r>
+      <w:r>
+        <w:rPr>
+          <w:rFonts w:ascii="Times New Roman" w:hAnsi="Times New Roman" w:cs="Times New Roman"/>
+        </w:rPr>
+        <w:t xml:space="preserve">This was implemented </w:t>
+      </w:r>
+      <w:r>
+        <w:rPr>
+          <w:rFonts w:ascii="Times New Roman" w:hAnsi="Times New Roman" w:cs="Times New Roman"/>
+        </w:rPr>
+        <w:t xml:space="preserve">by adding a new table in the database to store </w:t>
+      </w:r>
+      <w:r>
+        <w:rPr>
+          <w:rFonts w:ascii="Times New Roman" w:hAnsi="Times New Roman" w:cs="Times New Roman"/>
+        </w:rPr>
+        <w:t xml:space="preserve">the summary. Just like the original table, it is updated every 15 </w:t>
+      </w:r>
+      <w:r>
+        <w:rPr>
+          <w:rFonts w:ascii="Times New Roman" w:hAnsi="Times New Roman" w:cs="Times New Roman"/>
+        </w:rPr>
+        <w:t>minutes,</w:t>
+      </w:r>
+      <w:r>
+        <w:rPr>
+          <w:rFonts w:ascii="Times New Roman" w:hAnsi="Times New Roman" w:cs="Times New Roman"/>
+        </w:rPr>
+        <w:t xml:space="preserve"> and the entries are returned to the user </w:t>
+      </w:r>
+      <w:r>
+        <w:rPr>
+          <w:rFonts w:ascii="Times New Roman" w:hAnsi="Times New Roman" w:cs="Times New Roman"/>
+        </w:rPr>
         <w:t>whenever a request is made.</w:t>
       </w:r>
     </w:p>
     <w:p>
-      <w:r>
-        <w:t>Blobtransactions</w:t>
-      </w:r>
-    </w:p>
-    <w:p>
-      <w:r>
+      <w:pPr>
+        <w:pStyle w:val="Heading3"/>
+        <w:rPr>
+          <w:rFonts w:ascii="Times New Roman" w:hAnsi="Times New Roman" w:cs="Times New Roman"/>
+        </w:rPr>
+      </w:pPr>
+      <w:r>
+        <w:rPr>
+          <w:rFonts w:ascii="Times New Roman" w:hAnsi="Times New Roman" w:cs="Times New Roman"/>
+        </w:rPr>
+        <w:t>Blob Transactions</w:t>
+      </w:r>
+    </w:p>
+    <w:p>
+      <w:pPr>
+        <w:rPr>
+          <w:rFonts w:ascii="Times New Roman" w:hAnsi="Times New Roman" w:cs="Times New Roman"/>
+        </w:rPr>
+      </w:pPr>
+      <w:r>
+        <w:rPr>
+          <w:rFonts w:ascii="Times New Roman" w:hAnsi="Times New Roman" w:cs="Times New Roman"/>
+        </w:rPr>
         <w:tab/>
         <w:t xml:space="preserve">This endpoint returns the </w:t>
       </w:r>
       <w:r>
+        <w:rPr>
+          <w:rFonts w:ascii="Times New Roman" w:hAnsi="Times New Roman" w:cs="Times New Roman"/>
+        </w:rPr>
         <w:t xml:space="preserve">transactions contained within a blob. It searches for a specific blob by </w:t>
       </w:r>
       <w:r>
-        <w:t>versioned hash or kzg commit.</w:t>
-      </w:r>
-    </w:p>
-    <w:p>
-      <w:r>
-        <w:t>Blockgasprice</w:t>
-      </w:r>
-    </w:p>
-    <w:p>
-      <w:r>
+        <w:rPr>
+          <w:rFonts w:ascii="Times New Roman" w:hAnsi="Times New Roman" w:cs="Times New Roman"/>
+        </w:rPr>
+        <w:t xml:space="preserve">versioned hash or </w:t>
+      </w:r>
+      <w:proofErr w:type="spellStart"/>
+      <w:r>
+        <w:rPr>
+          <w:rFonts w:ascii="Times New Roman" w:hAnsi="Times New Roman" w:cs="Times New Roman"/>
+        </w:rPr>
+        <w:t>kzg</w:t>
+      </w:r>
+      <w:proofErr w:type="spellEnd"/>
+      <w:r>
+        <w:rPr>
+          <w:rFonts w:ascii="Times New Roman" w:hAnsi="Times New Roman" w:cs="Times New Roman"/>
+        </w:rPr>
+        <w:t xml:space="preserve"> commit.</w:t>
+      </w:r>
+      <w:r>
+        <w:rPr>
+          <w:rFonts w:ascii="Times New Roman" w:hAnsi="Times New Roman" w:cs="Times New Roman"/>
+        </w:rPr>
+        <w:t xml:space="preserve"> This allows users to quickly fetch information about the transactions contained within a blob without having to </w:t>
+      </w:r>
+      <w:r>
+        <w:rPr>
+          <w:rFonts w:ascii="Times New Roman" w:hAnsi="Times New Roman" w:cs="Times New Roman"/>
+        </w:rPr>
+        <w:t>arrive at this information indirectly through other API endpoints.</w:t>
+      </w:r>
+    </w:p>
+    <w:p>
+      <w:pPr>
+        <w:pStyle w:val="Heading3"/>
+        <w:rPr>
+          <w:rFonts w:ascii="Times New Roman" w:hAnsi="Times New Roman" w:cs="Times New Roman"/>
+        </w:rPr>
+      </w:pPr>
+      <w:r>
+        <w:rPr>
+          <w:rFonts w:ascii="Times New Roman" w:hAnsi="Times New Roman" w:cs="Times New Roman"/>
+        </w:rPr>
+        <w:t>Block Gas Price</w:t>
+      </w:r>
+    </w:p>
+    <w:p>
+      <w:pPr>
+        <w:rPr>
+          <w:rFonts w:ascii="Times New Roman" w:hAnsi="Times New Roman" w:cs="Times New Roman"/>
+        </w:rPr>
+      </w:pPr>
+      <w:r>
+        <w:rPr>
+          <w:rFonts w:ascii="Times New Roman" w:hAnsi="Times New Roman" w:cs="Times New Roman"/>
+        </w:rPr>
         <w:tab/>
-        <w:t xml:space="preserve">Returns the total blob gas price of a specific block. Limitations: </w:t>
-      </w:r>
-      <w:r>
-        <w:t>the Blobscan database only stores blocks that contain blobs. So a valid block id could be entered and the endpoint will return a 404 error. This is made clear in the documentation. Similarly, the previous endpoint block/{id} also has the same limitation. This was not mentioned anywhere. It has been added to the documentation.</w:t>
-      </w:r>
-    </w:p>
-    <w:p>
-      <w:r>
-        <w:t>Gastime</w:t>
-      </w:r>
-    </w:p>
-    <w:p>
-      <w:r>
+      </w:r>
+      <w:r>
+        <w:rPr>
+          <w:rFonts w:ascii="Times New Roman" w:hAnsi="Times New Roman" w:cs="Times New Roman"/>
+        </w:rPr>
+        <w:t>This endpoint r</w:t>
+      </w:r>
+      <w:r>
+        <w:rPr>
+          <w:rFonts w:ascii="Times New Roman" w:hAnsi="Times New Roman" w:cs="Times New Roman"/>
+        </w:rPr>
+        <w:t xml:space="preserve">eturns the total blob gas price of a specific block. </w:t>
+      </w:r>
+      <w:r>
+        <w:rPr>
+          <w:rFonts w:ascii="Times New Roman" w:hAnsi="Times New Roman" w:cs="Times New Roman"/>
+        </w:rPr>
+        <w:t>This endpoint does have one important l</w:t>
+      </w:r>
+      <w:r>
+        <w:rPr>
+          <w:rFonts w:ascii="Times New Roman" w:hAnsi="Times New Roman" w:cs="Times New Roman"/>
+        </w:rPr>
+        <w:t>imitation</w:t>
+      </w:r>
+      <w:r>
+        <w:rPr>
+          <w:rFonts w:ascii="Times New Roman" w:hAnsi="Times New Roman" w:cs="Times New Roman"/>
+        </w:rPr>
+        <w:t>. T</w:t>
+      </w:r>
+      <w:r>
+        <w:rPr>
+          <w:rFonts w:ascii="Times New Roman" w:hAnsi="Times New Roman" w:cs="Times New Roman"/>
+        </w:rPr>
+        <w:t>he Blobscan database only stores blocks that contain blobs. So</w:t>
+      </w:r>
+      <w:r>
+        <w:rPr>
+          <w:rFonts w:ascii="Times New Roman" w:hAnsi="Times New Roman" w:cs="Times New Roman"/>
+        </w:rPr>
+        <w:t>,</w:t>
+      </w:r>
+      <w:r>
+        <w:rPr>
+          <w:rFonts w:ascii="Times New Roman" w:hAnsi="Times New Roman" w:cs="Times New Roman"/>
+        </w:rPr>
+        <w:t xml:space="preserve"> a valid block </w:t>
+      </w:r>
+      <w:r>
+        <w:rPr>
+          <w:rFonts w:ascii="Times New Roman" w:hAnsi="Times New Roman" w:cs="Times New Roman"/>
+        </w:rPr>
+        <w:t>ID</w:t>
+      </w:r>
+      <w:r>
+        <w:rPr>
+          <w:rFonts w:ascii="Times New Roman" w:hAnsi="Times New Roman" w:cs="Times New Roman"/>
+        </w:rPr>
+        <w:t xml:space="preserve"> could be entered</w:t>
+      </w:r>
+      <w:r>
+        <w:rPr>
+          <w:rFonts w:ascii="Times New Roman" w:hAnsi="Times New Roman" w:cs="Times New Roman"/>
+        </w:rPr>
+        <w:t>, but t</w:t>
+      </w:r>
+      <w:r>
+        <w:rPr>
+          <w:rFonts w:ascii="Times New Roman" w:hAnsi="Times New Roman" w:cs="Times New Roman"/>
+        </w:rPr>
+        <w:t xml:space="preserve">he endpoint will </w:t>
+      </w:r>
+      <w:proofErr w:type="gramStart"/>
+      <w:r>
+        <w:rPr>
+          <w:rFonts w:ascii="Times New Roman" w:hAnsi="Times New Roman" w:cs="Times New Roman"/>
+        </w:rPr>
+        <w:t>return</w:t>
+      </w:r>
+      <w:proofErr w:type="gramEnd"/>
+      <w:r>
+        <w:rPr>
+          <w:rFonts w:ascii="Times New Roman" w:hAnsi="Times New Roman" w:cs="Times New Roman"/>
+        </w:rPr>
+        <w:t xml:space="preserve"> a 404 error. Similarly, the </w:t>
+      </w:r>
+      <w:r>
+        <w:rPr>
+          <w:rFonts w:ascii="Times New Roman" w:hAnsi="Times New Roman" w:cs="Times New Roman"/>
+        </w:rPr>
+        <w:t xml:space="preserve">existing endpoint that searches for a block </w:t>
+      </w:r>
+      <w:r>
+        <w:rPr>
+          <w:rFonts w:ascii="Times New Roman" w:hAnsi="Times New Roman" w:cs="Times New Roman"/>
+        </w:rPr>
+        <w:t>based on its ID</w:t>
+      </w:r>
+      <w:r>
+        <w:rPr>
+          <w:rFonts w:ascii="Times New Roman" w:hAnsi="Times New Roman" w:cs="Times New Roman"/>
+        </w:rPr>
+        <w:t xml:space="preserve"> has the same limitation. This was not mentioned anywhere</w:t>
+      </w:r>
+      <w:r>
+        <w:rPr>
+          <w:rFonts w:ascii="Times New Roman" w:hAnsi="Times New Roman" w:cs="Times New Roman"/>
+        </w:rPr>
+        <w:t xml:space="preserve"> in the original documentation</w:t>
+      </w:r>
+      <w:r>
+        <w:rPr>
+          <w:rFonts w:ascii="Times New Roman" w:hAnsi="Times New Roman" w:cs="Times New Roman"/>
+        </w:rPr>
+        <w:t xml:space="preserve">. </w:t>
+      </w:r>
+      <w:r>
+        <w:rPr>
+          <w:rFonts w:ascii="Times New Roman" w:hAnsi="Times New Roman" w:cs="Times New Roman"/>
+        </w:rPr>
+        <w:t>This limitation is now mentioned clearly in both the documentation of the new and original endpoint</w:t>
+      </w:r>
+      <w:r>
+        <w:rPr>
+          <w:rFonts w:ascii="Times New Roman" w:hAnsi="Times New Roman" w:cs="Times New Roman"/>
+        </w:rPr>
+        <w:t xml:space="preserve">s. </w:t>
+      </w:r>
+    </w:p>
+    <w:p>
+      <w:pPr>
+        <w:pStyle w:val="Heading3"/>
+        <w:rPr>
+          <w:rFonts w:ascii="Times New Roman" w:hAnsi="Times New Roman" w:cs="Times New Roman"/>
+        </w:rPr>
+      </w:pPr>
+      <w:r>
+        <w:rPr>
+          <w:rFonts w:ascii="Times New Roman" w:hAnsi="Times New Roman" w:cs="Times New Roman"/>
+        </w:rPr>
+        <w:t>Gas</w:t>
+      </w:r>
+      <w:r>
+        <w:rPr>
+          <w:rFonts w:ascii="Times New Roman" w:hAnsi="Times New Roman" w:cs="Times New Roman"/>
+        </w:rPr>
+        <w:t xml:space="preserve"> Time Data</w:t>
+      </w:r>
+    </w:p>
+    <w:p>
+      <w:pPr>
+        <w:rPr>
+          <w:rFonts w:ascii="Times New Roman" w:hAnsi="Times New Roman" w:cs="Times New Roman"/>
+        </w:rPr>
+      </w:pPr>
+      <w:r>
+        <w:rPr>
+          <w:rFonts w:ascii="Times New Roman" w:hAnsi="Times New Roman" w:cs="Times New Roman"/>
+        </w:rPr>
         <w:tab/>
-        <w:t>Retrieves the avgblob gas price of certain time ranges. This allows users to see how the avg blob gas price has changed of over the last day/week/etc or all time.</w:t>
-      </w:r>
-    </w:p>
-    <w:p>
-      <w:r>
+      </w:r>
+      <w:r>
+        <w:rPr>
+          <w:rFonts w:ascii="Times New Roman" w:hAnsi="Times New Roman" w:cs="Times New Roman"/>
+        </w:rPr>
+        <w:t>This endpoint r</w:t>
+      </w:r>
+      <w:r>
+        <w:rPr>
+          <w:rFonts w:ascii="Times New Roman" w:hAnsi="Times New Roman" w:cs="Times New Roman"/>
+        </w:rPr>
+        <w:t>etrieves the</w:t>
+      </w:r>
+      <w:r>
+        <w:rPr>
+          <w:rFonts w:ascii="Times New Roman" w:hAnsi="Times New Roman" w:cs="Times New Roman"/>
+        </w:rPr>
+        <w:t xml:space="preserve"> average blob</w:t>
+      </w:r>
+      <w:r>
+        <w:rPr>
+          <w:rFonts w:ascii="Times New Roman" w:hAnsi="Times New Roman" w:cs="Times New Roman"/>
+        </w:rPr>
+        <w:t xml:space="preserve"> gas price of certain time ranges. </w:t>
+      </w:r>
+      <w:r>
+        <w:rPr>
+          <w:rFonts w:ascii="Times New Roman" w:hAnsi="Times New Roman" w:cs="Times New Roman"/>
+        </w:rPr>
+        <w:t>Specifically,</w:t>
+      </w:r>
+      <w:r>
+        <w:rPr>
+          <w:rFonts w:ascii="Times New Roman" w:hAnsi="Times New Roman" w:cs="Times New Roman"/>
+        </w:rPr>
+        <w:t xml:space="preserve"> a user can get information </w:t>
+      </w:r>
+      <w:r>
+        <w:rPr>
+          <w:rFonts w:ascii="Times New Roman" w:hAnsi="Times New Roman" w:cs="Times New Roman"/>
+        </w:rPr>
+        <w:t>about</w:t>
+      </w:r>
+      <w:r>
+        <w:rPr>
+          <w:rFonts w:ascii="Times New Roman" w:hAnsi="Times New Roman" w:cs="Times New Roman"/>
+        </w:rPr>
+        <w:t xml:space="preserve"> </w:t>
+      </w:r>
+      <w:r>
+        <w:rPr>
+          <w:rFonts w:ascii="Times New Roman" w:hAnsi="Times New Roman" w:cs="Times New Roman"/>
+        </w:rPr>
+        <w:t xml:space="preserve">the all-time average gas price, or the most recent day, week, </w:t>
+      </w:r>
+      <w:r>
+        <w:rPr>
+          <w:rFonts w:ascii="Times New Roman" w:hAnsi="Times New Roman" w:cs="Times New Roman"/>
+        </w:rPr>
+        <w:t>month, etc.</w:t>
+      </w:r>
+      <w:r>
+        <w:rPr>
+          <w:rFonts w:ascii="Times New Roman" w:hAnsi="Times New Roman" w:cs="Times New Roman"/>
+        </w:rPr>
+        <w:t xml:space="preserve"> </w:t>
+      </w:r>
+      <w:r>
+        <w:rPr>
+          <w:rFonts w:ascii="Times New Roman" w:hAnsi="Times New Roman" w:cs="Times New Roman"/>
+        </w:rPr>
+        <w:t>This allows users to see how the</w:t>
+      </w:r>
+      <w:r>
+        <w:rPr>
+          <w:rFonts w:ascii="Times New Roman" w:hAnsi="Times New Roman" w:cs="Times New Roman"/>
+        </w:rPr>
+        <w:t xml:space="preserve"> average</w:t>
+      </w:r>
+      <w:r>
+        <w:rPr>
+          <w:rFonts w:ascii="Times New Roman" w:hAnsi="Times New Roman" w:cs="Times New Roman"/>
+        </w:rPr>
+        <w:t xml:space="preserve"> blob gas price has </w:t>
+      </w:r>
+      <w:r>
+        <w:rPr>
+          <w:rFonts w:ascii="Times New Roman" w:hAnsi="Times New Roman" w:cs="Times New Roman"/>
+        </w:rPr>
+        <w:t>changed</w:t>
+      </w:r>
+      <w:r>
+        <w:rPr>
+          <w:rFonts w:ascii="Times New Roman" w:hAnsi="Times New Roman" w:cs="Times New Roman"/>
+        </w:rPr>
+        <w:t xml:space="preserve"> over </w:t>
+      </w:r>
+      <w:r>
+        <w:rPr>
+          <w:rFonts w:ascii="Times New Roman" w:hAnsi="Times New Roman" w:cs="Times New Roman"/>
+        </w:rPr>
+        <w:t xml:space="preserve">a time </w:t>
+      </w:r>
+      <w:r>
+        <w:rPr>
+          <w:rFonts w:ascii="Times New Roman" w:hAnsi="Times New Roman" w:cs="Times New Roman"/>
+        </w:rPr>
+        <w:lastRenderedPageBreak/>
+        <w:t>range. This endpoint also returns the timestamps associated with the values returned. This way, the user can see the specific time the average gas price was calculated at.</w:t>
+      </w:r>
+    </w:p>
+    <w:p>
+      <w:pPr>
+        <w:pStyle w:val="Heading3"/>
+        <w:rPr>
+          <w:rFonts w:ascii="Times New Roman" w:hAnsi="Times New Roman" w:cs="Times New Roman"/>
+        </w:rPr>
+      </w:pPr>
+      <w:r>
+        <w:rPr>
+          <w:rFonts w:ascii="Times New Roman" w:hAnsi="Times New Roman" w:cs="Times New Roman"/>
+        </w:rPr>
+        <w:t>Installation Guide Improvements</w:t>
+      </w:r>
+    </w:p>
+    <w:p>
+      <w:pPr>
+        <w:rPr>
+          <w:rFonts w:ascii="Times New Roman" w:hAnsi="Times New Roman" w:cs="Times New Roman"/>
+        </w:rPr>
+      </w:pPr>
+      <w:r>
+        <w:rPr>
+          <w:rFonts w:ascii="Times New Roman" w:hAnsi="Times New Roman" w:cs="Times New Roman"/>
+        </w:rPr>
         <w:tab/>
-        <w:t>The returned gas prices come with timestamps.</w:t>
-      </w:r>
-    </w:p>
-    <w:p>
-      <w:r>
-        <w:t>Initial installation of the Blobscan repository</w:t>
-      </w:r>
-    </w:p>
-    <w:p>
-      <w:r>
-        <w:lastRenderedPageBreak/>
-        <w:tab/>
-        <w:t>Difficult and kept kept crashing</w:t>
-      </w:r>
-    </w:p>
-    <w:p>
-      <w:r>
-        <w:tab/>
-        <w:t xml:space="preserve">Decide to update the </w:t>
-      </w:r>
-      <w:r>
-        <w:t>installation page</w:t>
+        <w:t>Initial work on this project was slow due to issues trying to run the repository</w:t>
+      </w:r>
+      <w:r>
+        <w:rPr>
+          <w:rFonts w:ascii="Times New Roman" w:hAnsi="Times New Roman" w:cs="Times New Roman"/>
+        </w:rPr>
+        <w:t xml:space="preserve">. Blobscan publishes Docker containers, but these </w:t>
+      </w:r>
+      <w:r>
+        <w:rPr>
+          <w:rFonts w:ascii="Times New Roman" w:hAnsi="Times New Roman" w:cs="Times New Roman"/>
+        </w:rPr>
+        <w:t>could not be rebuilt whenever changes were made to the repository. As a result, the repository ha</w:t>
+      </w:r>
+      <w:r>
+        <w:rPr>
+          <w:rFonts w:ascii="Times New Roman" w:hAnsi="Times New Roman" w:cs="Times New Roman"/>
+        </w:rPr>
+        <w:t>d</w:t>
+      </w:r>
+      <w:r>
+        <w:rPr>
+          <w:rFonts w:ascii="Times New Roman" w:hAnsi="Times New Roman" w:cs="Times New Roman"/>
+        </w:rPr>
+        <w:t xml:space="preserve"> to be run locally</w:t>
+      </w:r>
+      <w:r>
+        <w:rPr>
+          <w:rFonts w:ascii="Times New Roman" w:hAnsi="Times New Roman" w:cs="Times New Roman"/>
+        </w:rPr>
+        <w:t xml:space="preserve">. Following </w:t>
+      </w:r>
+      <w:proofErr w:type="gramStart"/>
+      <w:r>
+        <w:rPr>
+          <w:rFonts w:ascii="Times New Roman" w:hAnsi="Times New Roman" w:cs="Times New Roman"/>
+        </w:rPr>
+        <w:t>the installation</w:t>
+      </w:r>
+      <w:proofErr w:type="gramEnd"/>
+      <w:r>
+        <w:rPr>
+          <w:rFonts w:ascii="Times New Roman" w:hAnsi="Times New Roman" w:cs="Times New Roman"/>
+        </w:rPr>
+        <w:t xml:space="preserve"> guide on the Blobscan documentation page didn’t work. After a lot of troubleshooting, the code could be run locally. </w:t>
+      </w:r>
+      <w:r>
+        <w:rPr>
+          <w:rFonts w:ascii="Times New Roman" w:hAnsi="Times New Roman" w:cs="Times New Roman"/>
+        </w:rPr>
+        <w:t xml:space="preserve">The original installation guide </w:t>
+      </w:r>
+      <w:r>
+        <w:rPr>
+          <w:rFonts w:ascii="Times New Roman" w:hAnsi="Times New Roman" w:cs="Times New Roman"/>
+        </w:rPr>
+        <w:t>appears to be</w:t>
+      </w:r>
+      <w:r>
+        <w:rPr>
+          <w:rFonts w:ascii="Times New Roman" w:hAnsi="Times New Roman" w:cs="Times New Roman"/>
+        </w:rPr>
+        <w:t xml:space="preserve"> out of date, so it has been updated.</w:t>
       </w:r>
     </w:p>
     <w:p>
@@ -542,7 +1362,7 @@
                     <pic:cNvPicPr/>
                   </pic:nvPicPr>
                   <pic:blipFill>
-                    <a:blip r:embed="rId9"/>
+                    <a:blip r:embed="rId10"/>
                     <a:stretch>
                       <a:fillRect/>
                     </a:stretch>
@@ -587,6 +1407,7 @@
           <w:rFonts w:ascii="Times New Roman" w:hAnsi="Times New Roman" w:cs="Times New Roman"/>
           <w:noProof/>
         </w:rPr>
+        <w:lastRenderedPageBreak/>
         <w:drawing>
           <wp:inline distT="0" distB="0" distL="0" distR="0" wp14:anchorId="7934D4A4" wp14:editId="1AD29298">
             <wp:extent cx="5943600" cy="2555240"/>
@@ -603,7 +1424,7 @@
                     <pic:cNvPicPr/>
                   </pic:nvPicPr>
                   <pic:blipFill>
-                    <a:blip r:embed="rId10"/>
+                    <a:blip r:embed="rId11"/>
                     <a:stretch>
                       <a:fillRect/>
                     </a:stretch>
@@ -634,19 +1455,7 @@
         <w:rPr>
           <w:rFonts w:ascii="Times New Roman" w:hAnsi="Times New Roman" w:cs="Times New Roman"/>
         </w:rPr>
-        <w:t>Original blo</w:t>
-      </w:r>
-      <w:r>
-        <w:rPr>
-          <w:rFonts w:ascii="Times New Roman" w:hAnsi="Times New Roman" w:cs="Times New Roman"/>
-        </w:rPr>
-        <w:t>cks</w:t>
-      </w:r>
-      <w:r>
-        <w:rPr>
-          <w:rFonts w:ascii="Times New Roman" w:hAnsi="Times New Roman" w:cs="Times New Roman"/>
-        </w:rPr>
-        <w:t xml:space="preserve"> API endpoints:</w:t>
+        <w:t>Original blocks API endpoints:</w:t>
       </w:r>
     </w:p>
     <w:p>
@@ -660,7 +1469,6 @@
           <w:rFonts w:ascii="Times New Roman" w:hAnsi="Times New Roman" w:cs="Times New Roman"/>
           <w:noProof/>
         </w:rPr>
-        <w:lastRenderedPageBreak/>
         <w:drawing>
           <wp:inline distT="0" distB="0" distL="0" distR="0" wp14:anchorId="03B749C2" wp14:editId="57C50631">
             <wp:extent cx="5943600" cy="1727835"/>
@@ -677,7 +1485,7 @@
                     <pic:cNvPicPr/>
                   </pic:nvPicPr>
                   <pic:blipFill>
-                    <a:blip r:embed="rId11"/>
+                    <a:blip r:embed="rId12"/>
                     <a:stretch>
                       <a:fillRect/>
                     </a:stretch>
@@ -738,7 +1546,7 @@
                     <pic:cNvPicPr/>
                   </pic:nvPicPr>
                   <pic:blipFill>
-                    <a:blip r:embed="rId12"/>
+                    <a:blip r:embed="rId13"/>
                     <a:stretch>
                       <a:fillRect/>
                     </a:stretch>
@@ -769,19 +1577,7 @@
         <w:rPr>
           <w:rFonts w:ascii="Times New Roman" w:hAnsi="Times New Roman" w:cs="Times New Roman"/>
         </w:rPr>
-        <w:t xml:space="preserve">Original </w:t>
-      </w:r>
-      <w:r>
-        <w:rPr>
-          <w:rFonts w:ascii="Times New Roman" w:hAnsi="Times New Roman" w:cs="Times New Roman"/>
-        </w:rPr>
-        <w:t>stats</w:t>
-      </w:r>
-      <w:r>
-        <w:rPr>
-          <w:rFonts w:ascii="Times New Roman" w:hAnsi="Times New Roman" w:cs="Times New Roman"/>
-        </w:rPr>
-        <w:t xml:space="preserve"> API endpoints:</w:t>
+        <w:t>Original stats API endpoints:</w:t>
       </w:r>
     </w:p>
     <w:p>
@@ -795,6 +1591,7 @@
           <w:rFonts w:ascii="Times New Roman" w:hAnsi="Times New Roman" w:cs="Times New Roman"/>
           <w:noProof/>
         </w:rPr>
+        <w:lastRenderedPageBreak/>
         <w:drawing>
           <wp:inline distT="0" distB="0" distL="0" distR="0" wp14:anchorId="0B44559A" wp14:editId="34826900">
             <wp:extent cx="5943600" cy="2126615"/>
@@ -811,7 +1608,7 @@
                     <pic:cNvPicPr/>
                   </pic:nvPicPr>
                   <pic:blipFill>
-                    <a:blip r:embed="rId13"/>
+                    <a:blip r:embed="rId14"/>
                     <a:stretch>
                       <a:fillRect/>
                     </a:stretch>
@@ -856,7 +1653,6 @@
           <w:rFonts w:ascii="Times New Roman" w:hAnsi="Times New Roman" w:cs="Times New Roman"/>
           <w:noProof/>
         </w:rPr>
-        <w:lastRenderedPageBreak/>
         <w:drawing>
           <wp:inline distT="0" distB="0" distL="0" distR="0" wp14:anchorId="6046FA3C" wp14:editId="09F1B3E9">
             <wp:extent cx="5943600" cy="2847340"/>
@@ -873,7 +1669,7 @@
                     <pic:cNvPicPr/>
                   </pic:nvPicPr>
                   <pic:blipFill>
-                    <a:blip r:embed="rId14"/>
+                    <a:blip r:embed="rId15"/>
                     <a:stretch>
                       <a:fillRect/>
                     </a:stretch>
@@ -911,7 +1707,35 @@
         <w:rPr>
           <w:rFonts w:ascii="Times New Roman" w:hAnsi="Times New Roman" w:cs="Times New Roman"/>
         </w:rPr>
-        <w:t>the added API endpoints can be found within /packages/api/src/routers.</w:t>
+        <w:t>the added API endpoints can be found within /packages/</w:t>
+      </w:r>
+      <w:proofErr w:type="spellStart"/>
+      <w:r>
+        <w:rPr>
+          <w:rFonts w:ascii="Times New Roman" w:hAnsi="Times New Roman" w:cs="Times New Roman"/>
+        </w:rPr>
+        <w:t>api</w:t>
+      </w:r>
+      <w:proofErr w:type="spellEnd"/>
+      <w:r>
+        <w:rPr>
+          <w:rFonts w:ascii="Times New Roman" w:hAnsi="Times New Roman" w:cs="Times New Roman"/>
+        </w:rPr>
+        <w:t>/</w:t>
+      </w:r>
+      <w:proofErr w:type="spellStart"/>
+      <w:r>
+        <w:rPr>
+          <w:rFonts w:ascii="Times New Roman" w:hAnsi="Times New Roman" w:cs="Times New Roman"/>
+        </w:rPr>
+        <w:t>src</w:t>
+      </w:r>
+      <w:proofErr w:type="spellEnd"/>
+      <w:r>
+        <w:rPr>
+          <w:rFonts w:ascii="Times New Roman" w:hAnsi="Times New Roman" w:cs="Times New Roman"/>
+        </w:rPr>
+        <w:t>/routers.</w:t>
       </w:r>
       <w:r>
         <w:rPr>
@@ -941,8 +1765,16 @@
         <w:rPr>
           <w:rFonts w:ascii="Times New Roman" w:hAnsi="Times New Roman" w:cs="Times New Roman"/>
         </w:rPr>
-        <w:t>stats/getGasSummary.ts</w:t>
-      </w:r>
+        <w:t>stats/</w:t>
+      </w:r>
+      <w:proofErr w:type="spellStart"/>
+      <w:r>
+        <w:rPr>
+          <w:rFonts w:ascii="Times New Roman" w:hAnsi="Times New Roman" w:cs="Times New Roman"/>
+        </w:rPr>
+        <w:t>getGasSummary.ts</w:t>
+      </w:r>
+      <w:proofErr w:type="spellEnd"/>
     </w:p>
     <w:p>
       <w:pPr>
@@ -965,8 +1797,16 @@
         <w:rPr>
           <w:rFonts w:ascii="Times New Roman" w:hAnsi="Times New Roman" w:cs="Times New Roman"/>
         </w:rPr>
-        <w:t>stats/getGasTime.ts</w:t>
-      </w:r>
+        <w:t>stats/</w:t>
+      </w:r>
+      <w:proofErr w:type="spellStart"/>
+      <w:r>
+        <w:rPr>
+          <w:rFonts w:ascii="Times New Roman" w:hAnsi="Times New Roman" w:cs="Times New Roman"/>
+        </w:rPr>
+        <w:t>getGasTime.ts</w:t>
+      </w:r>
+      <w:proofErr w:type="spellEnd"/>
     </w:p>
     <w:p>
       <w:pPr>
@@ -989,8 +1829,16 @@
         <w:rPr>
           <w:rFonts w:ascii="Times New Roman" w:hAnsi="Times New Roman" w:cs="Times New Roman"/>
         </w:rPr>
-        <w:t>blob/getBlobTransactions.ts</w:t>
-      </w:r>
+        <w:t>blob/</w:t>
+      </w:r>
+      <w:proofErr w:type="spellStart"/>
+      <w:r>
+        <w:rPr>
+          <w:rFonts w:ascii="Times New Roman" w:hAnsi="Times New Roman" w:cs="Times New Roman"/>
+        </w:rPr>
+        <w:t>getBlobTransactions.ts</w:t>
+      </w:r>
+      <w:proofErr w:type="spellEnd"/>
     </w:p>
     <w:p>
       <w:pPr>
@@ -1013,8 +1861,16 @@
         <w:rPr>
           <w:rFonts w:ascii="Times New Roman" w:hAnsi="Times New Roman" w:cs="Times New Roman"/>
         </w:rPr>
-        <w:t>block/getBlockGasPrice.ts</w:t>
-      </w:r>
+        <w:t>block/</w:t>
+      </w:r>
+      <w:proofErr w:type="spellStart"/>
+      <w:r>
+        <w:rPr>
+          <w:rFonts w:ascii="Times New Roman" w:hAnsi="Times New Roman" w:cs="Times New Roman"/>
+        </w:rPr>
+        <w:t>getBlockGasPrice.ts</w:t>
+      </w:r>
+      <w:proofErr w:type="spellEnd"/>
     </w:p>
     <w:p>
       <w:pPr>
@@ -1057,25 +1913,21 @@
         <w:rPr>
           <w:rFonts w:ascii="Times New Roman" w:hAnsi="Times New Roman" w:cs="Times New Roman"/>
         </w:rPr>
-        <w:t xml:space="preserve"> </w:t>
-      </w:r>
-      <w:r>
-        <w:rPr>
-          <w:rFonts w:ascii="Times New Roman" w:hAnsi="Times New Roman" w:cs="Times New Roman"/>
-        </w:rPr>
-        <w:t>/packages/api/</w:t>
-      </w:r>
-      <w:r>
-        <w:rPr>
-          <w:rFonts w:ascii="Times New Roman" w:hAnsi="Times New Roman" w:cs="Times New Roman"/>
-        </w:rPr>
-        <w:t>test</w:t>
-      </w:r>
-      <w:r>
-        <w:rPr>
-          <w:rFonts w:ascii="Times New Roman" w:hAnsi="Times New Roman" w:cs="Times New Roman"/>
-        </w:rPr>
-        <w:t>.</w:t>
+        <w:t xml:space="preserve"> /packages/</w:t>
+      </w:r>
+      <w:proofErr w:type="spellStart"/>
+      <w:r>
+        <w:rPr>
+          <w:rFonts w:ascii="Times New Roman" w:hAnsi="Times New Roman" w:cs="Times New Roman"/>
+        </w:rPr>
+        <w:t>api</w:t>
+      </w:r>
+      <w:proofErr w:type="spellEnd"/>
+      <w:r>
+        <w:rPr>
+          <w:rFonts w:ascii="Times New Roman" w:hAnsi="Times New Roman" w:cs="Times New Roman"/>
+        </w:rPr>
+        <w:t>/test.</w:t>
       </w:r>
       <w:r>
         <w:rPr>
@@ -1105,20 +1957,16 @@
         <w:rPr>
           <w:rFonts w:ascii="Times New Roman" w:hAnsi="Times New Roman" w:cs="Times New Roman"/>
         </w:rPr>
-        <w:t>/stats/getGasSummary.</w:t>
-      </w:r>
-      <w:r>
-        <w:rPr>
-          <w:rFonts w:ascii="Times New Roman" w:hAnsi="Times New Roman" w:cs="Times New Roman"/>
-        </w:rPr>
-        <w:t>test.</w:t>
-      </w:r>
-      <w:r>
-        <w:rPr>
-          <w:rFonts w:ascii="Times New Roman" w:hAnsi="Times New Roman" w:cs="Times New Roman"/>
-        </w:rPr>
-        <w:t>ts</w:t>
-      </w:r>
+        <w:t>/stats/</w:t>
+      </w:r>
+      <w:proofErr w:type="spellStart"/>
+      <w:r>
+        <w:rPr>
+          <w:rFonts w:ascii="Times New Roman" w:hAnsi="Times New Roman" w:cs="Times New Roman"/>
+        </w:rPr>
+        <w:t>getGasSummary.test.ts</w:t>
+      </w:r>
+      <w:proofErr w:type="spellEnd"/>
     </w:p>
     <w:p>
       <w:pPr>
@@ -1148,7 +1996,7 @@
                     <pic:cNvPicPr/>
                   </pic:nvPicPr>
                   <pic:blipFill>
-                    <a:blip r:embed="rId15"/>
+                    <a:blip r:embed="rId16"/>
                     <a:stretch>
                       <a:fillRect/>
                     </a:stretch>
@@ -1184,20 +2032,16 @@
         <w:rPr>
           <w:rFonts w:ascii="Times New Roman" w:hAnsi="Times New Roman" w:cs="Times New Roman"/>
         </w:rPr>
-        <w:t>/stats/getGasTime.</w:t>
-      </w:r>
-      <w:r>
-        <w:rPr>
-          <w:rFonts w:ascii="Times New Roman" w:hAnsi="Times New Roman" w:cs="Times New Roman"/>
-        </w:rPr>
-        <w:t>test.</w:t>
-      </w:r>
-      <w:r>
-        <w:rPr>
-          <w:rFonts w:ascii="Times New Roman" w:hAnsi="Times New Roman" w:cs="Times New Roman"/>
-        </w:rPr>
-        <w:t>ts</w:t>
-      </w:r>
+        <w:t>/stats/</w:t>
+      </w:r>
+      <w:proofErr w:type="spellStart"/>
+      <w:r>
+        <w:rPr>
+          <w:rFonts w:ascii="Times New Roman" w:hAnsi="Times New Roman" w:cs="Times New Roman"/>
+        </w:rPr>
+        <w:t>getGasTime.test.ts</w:t>
+      </w:r>
+      <w:proofErr w:type="spellEnd"/>
     </w:p>
     <w:p>
       <w:pPr>
@@ -1211,6 +2055,7 @@
           <w:rFonts w:ascii="Times New Roman" w:hAnsi="Times New Roman" w:cs="Times New Roman"/>
           <w:noProof/>
         </w:rPr>
+        <w:lastRenderedPageBreak/>
         <w:drawing>
           <wp:inline distT="0" distB="0" distL="0" distR="0" wp14:anchorId="795942AB" wp14:editId="705F8A5C">
             <wp:extent cx="4638675" cy="219075"/>
@@ -1227,7 +2072,7 @@
                     <pic:cNvPicPr/>
                   </pic:nvPicPr>
                   <pic:blipFill>
-                    <a:blip r:embed="rId16"/>
+                    <a:blip r:embed="rId17"/>
                     <a:stretch>
                       <a:fillRect/>
                     </a:stretch>
@@ -1263,20 +2108,32 @@
         <w:rPr>
           <w:rFonts w:ascii="Times New Roman" w:hAnsi="Times New Roman" w:cs="Times New Roman"/>
         </w:rPr>
-        <w:t>/blob/getBlobTransactions.</w:t>
-      </w:r>
-      <w:r>
-        <w:rPr>
-          <w:rFonts w:ascii="Times New Roman" w:hAnsi="Times New Roman" w:cs="Times New Roman"/>
-        </w:rPr>
-        <w:t>.test.</w:t>
-      </w:r>
-      <w:r>
-        <w:rPr>
-          <w:rFonts w:ascii="Times New Roman" w:hAnsi="Times New Roman" w:cs="Times New Roman"/>
-        </w:rPr>
-        <w:t>ts</w:t>
-      </w:r>
+        <w:t>/blob/</w:t>
+      </w:r>
+      <w:proofErr w:type="spellStart"/>
+      <w:proofErr w:type="gramStart"/>
+      <w:r>
+        <w:rPr>
+          <w:rFonts w:ascii="Times New Roman" w:hAnsi="Times New Roman" w:cs="Times New Roman"/>
+        </w:rPr>
+        <w:t>getBlobTransactions</w:t>
+      </w:r>
+      <w:proofErr w:type="spellEnd"/>
+      <w:r>
+        <w:rPr>
+          <w:rFonts w:ascii="Times New Roman" w:hAnsi="Times New Roman" w:cs="Times New Roman"/>
+        </w:rPr>
+        <w:t>..</w:t>
+      </w:r>
+      <w:proofErr w:type="spellStart"/>
+      <w:proofErr w:type="gramEnd"/>
+      <w:r>
+        <w:rPr>
+          <w:rFonts w:ascii="Times New Roman" w:hAnsi="Times New Roman" w:cs="Times New Roman"/>
+        </w:rPr>
+        <w:t>test.ts</w:t>
+      </w:r>
+      <w:proofErr w:type="spellEnd"/>
     </w:p>
     <w:p>
       <w:pPr>
@@ -1306,7 +2163,7 @@
                     <pic:cNvPicPr/>
                   </pic:nvPicPr>
                   <pic:blipFill>
-                    <a:blip r:embed="rId17"/>
+                    <a:blip r:embed="rId18"/>
                     <a:stretch>
                       <a:fillRect/>
                     </a:stretch>
@@ -1342,20 +2199,16 @@
         <w:rPr>
           <w:rFonts w:ascii="Times New Roman" w:hAnsi="Times New Roman" w:cs="Times New Roman"/>
         </w:rPr>
-        <w:t>/block/getBlockGasPrice.</w:t>
-      </w:r>
-      <w:r>
-        <w:rPr>
-          <w:rFonts w:ascii="Times New Roman" w:hAnsi="Times New Roman" w:cs="Times New Roman"/>
-        </w:rPr>
-        <w:t>test.</w:t>
-      </w:r>
-      <w:r>
-        <w:rPr>
-          <w:rFonts w:ascii="Times New Roman" w:hAnsi="Times New Roman" w:cs="Times New Roman"/>
-        </w:rPr>
-        <w:t>ts</w:t>
-      </w:r>
+        <w:t>/block/</w:t>
+      </w:r>
+      <w:proofErr w:type="spellStart"/>
+      <w:r>
+        <w:rPr>
+          <w:rFonts w:ascii="Times New Roman" w:hAnsi="Times New Roman" w:cs="Times New Roman"/>
+        </w:rPr>
+        <w:t>getBlockGasPrice.test.ts</w:t>
+      </w:r>
+      <w:proofErr w:type="spellEnd"/>
     </w:p>
     <w:p>
       <w:pPr>
@@ -1385,7 +2238,7 @@
                     <pic:cNvPicPr/>
                   </pic:nvPicPr>
                   <pic:blipFill>
-                    <a:blip r:embed="rId18"/>
+                    <a:blip r:embed="rId19"/>
                     <a:stretch>
                       <a:fillRect/>
                     </a:stretch>
@@ -1428,26 +2281,81 @@
         <w:rPr>
           <w:rFonts w:ascii="Times New Roman" w:hAnsi="Times New Roman" w:cs="Times New Roman"/>
         </w:rPr>
-        <w:t xml:space="preserve">/packages/db/prisma/schema.prisma. </w:t>
-      </w:r>
-      <w:r>
-        <w:rPr>
-          <w:rFonts w:ascii="Times New Roman" w:hAnsi="Times New Roman" w:cs="Times New Roman"/>
-        </w:rPr>
-        <w:t>The model GasStats previously did not exist and was added.</w:t>
-      </w:r>
-    </w:p>
-    <w:p>
-      <w:pPr>
-        <w:rPr>
-          <w:rFonts w:ascii="Times New Roman" w:hAnsi="Times New Roman" w:cs="Times New Roman"/>
-        </w:rPr>
-      </w:pPr>
-      <w:r>
-        <w:rPr>
-          <w:rFonts w:ascii="Times New Roman" w:hAnsi="Times New Roman" w:cs="Times New Roman"/>
-        </w:rPr>
-        <w:lastRenderedPageBreak/>
+        <w:t>/packages/</w:t>
+      </w:r>
+      <w:proofErr w:type="spellStart"/>
+      <w:r>
+        <w:rPr>
+          <w:rFonts w:ascii="Times New Roman" w:hAnsi="Times New Roman" w:cs="Times New Roman"/>
+        </w:rPr>
+        <w:t>db</w:t>
+      </w:r>
+      <w:proofErr w:type="spellEnd"/>
+      <w:r>
+        <w:rPr>
+          <w:rFonts w:ascii="Times New Roman" w:hAnsi="Times New Roman" w:cs="Times New Roman"/>
+        </w:rPr>
+        <w:t>/</w:t>
+      </w:r>
+      <w:proofErr w:type="spellStart"/>
+      <w:r>
+        <w:rPr>
+          <w:rFonts w:ascii="Times New Roman" w:hAnsi="Times New Roman" w:cs="Times New Roman"/>
+        </w:rPr>
+        <w:t>prisma</w:t>
+      </w:r>
+      <w:proofErr w:type="spellEnd"/>
+      <w:r>
+        <w:rPr>
+          <w:rFonts w:ascii="Times New Roman" w:hAnsi="Times New Roman" w:cs="Times New Roman"/>
+        </w:rPr>
+        <w:t>/</w:t>
+      </w:r>
+      <w:proofErr w:type="spellStart"/>
+      <w:r>
+        <w:rPr>
+          <w:rFonts w:ascii="Times New Roman" w:hAnsi="Times New Roman" w:cs="Times New Roman"/>
+        </w:rPr>
+        <w:t>schema.prisma</w:t>
+      </w:r>
+      <w:proofErr w:type="spellEnd"/>
+      <w:r>
+        <w:rPr>
+          <w:rFonts w:ascii="Times New Roman" w:hAnsi="Times New Roman" w:cs="Times New Roman"/>
+        </w:rPr>
+        <w:t xml:space="preserve">. </w:t>
+      </w:r>
+      <w:r>
+        <w:rPr>
+          <w:rFonts w:ascii="Times New Roman" w:hAnsi="Times New Roman" w:cs="Times New Roman"/>
+        </w:rPr>
+        <w:t xml:space="preserve">The model </w:t>
+      </w:r>
+      <w:proofErr w:type="spellStart"/>
+      <w:r>
+        <w:rPr>
+          <w:rFonts w:ascii="Times New Roman" w:hAnsi="Times New Roman" w:cs="Times New Roman"/>
+        </w:rPr>
+        <w:t>GasStats</w:t>
+      </w:r>
+      <w:proofErr w:type="spellEnd"/>
+      <w:r>
+        <w:rPr>
+          <w:rFonts w:ascii="Times New Roman" w:hAnsi="Times New Roman" w:cs="Times New Roman"/>
+        </w:rPr>
+        <w:t xml:space="preserve"> previously did not exist and was added.</w:t>
+      </w:r>
+    </w:p>
+    <w:p>
+      <w:pPr>
+        <w:rPr>
+          <w:rFonts w:ascii="Times New Roman" w:hAnsi="Times New Roman" w:cs="Times New Roman"/>
+        </w:rPr>
+      </w:pPr>
+      <w:r>
+        <w:rPr>
+          <w:rFonts w:ascii="Times New Roman" w:hAnsi="Times New Roman" w:cs="Times New Roman"/>
+        </w:rPr>
         <w:t xml:space="preserve">A PR was submitted to the original Blobscan repository. </w:t>
       </w:r>
       <w:r>
@@ -1462,6 +2370,18 @@
         </w:rPr>
         <w:t>The API endpoints and their tests were not included because of the required changes to the database.</w:t>
       </w:r>
+      <w:r>
+        <w:rPr>
+          <w:rFonts w:ascii="Times New Roman" w:hAnsi="Times New Roman" w:cs="Times New Roman"/>
+        </w:rPr>
+        <w:t xml:space="preserve"> </w:t>
+      </w:r>
+      <w:r>
+        <w:rPr>
+          <w:rFonts w:ascii="Times New Roman" w:hAnsi="Times New Roman" w:cs="Times New Roman"/>
+        </w:rPr>
+        <w:t>To view the API endpoints functioning, please watch the demonstration video linked at the top of this report.</w:t>
+      </w:r>
     </w:p>
     <w:p>
       <w:pPr>
@@ -1479,6 +2399,68 @@
     </w:p>
     <w:p>
       <w:pPr>
+        <w:rPr>
+          <w:rFonts w:ascii="Times New Roman" w:hAnsi="Times New Roman" w:cs="Times New Roman"/>
+        </w:rPr>
+      </w:pPr>
+      <w:r>
+        <w:rPr>
+          <w:rFonts w:ascii="Times New Roman" w:hAnsi="Times New Roman" w:cs="Times New Roman"/>
+        </w:rPr>
+        <w:tab/>
+        <w:t xml:space="preserve">This project contributed to the open-source </w:t>
+      </w:r>
+      <w:r>
+        <w:rPr>
+          <w:rFonts w:ascii="Times New Roman" w:hAnsi="Times New Roman" w:cs="Times New Roman"/>
+        </w:rPr>
+        <w:t xml:space="preserve">Ethereum blockchain explorer Blobscan. Blobscan allows users and developers to analyze Ethereum blobs through their website or using their public API. </w:t>
+      </w:r>
+      <w:r>
+        <w:rPr>
+          <w:rFonts w:ascii="Times New Roman" w:hAnsi="Times New Roman" w:cs="Times New Roman"/>
+        </w:rPr>
+        <w:t xml:space="preserve">This project added </w:t>
+      </w:r>
+      <w:r>
+        <w:rPr>
+          <w:rFonts w:ascii="Times New Roman" w:hAnsi="Times New Roman" w:cs="Times New Roman"/>
+        </w:rPr>
+        <w:t>four</w:t>
+      </w:r>
+      <w:r>
+        <w:rPr>
+          <w:rFonts w:ascii="Times New Roman" w:hAnsi="Times New Roman" w:cs="Times New Roman"/>
+        </w:rPr>
+        <w:t xml:space="preserve"> new API endpoints along with corresponding tests and documentation. </w:t>
+      </w:r>
+      <w:r>
+        <w:rPr>
+          <w:rFonts w:ascii="Times New Roman" w:hAnsi="Times New Roman" w:cs="Times New Roman"/>
+        </w:rPr>
+        <w:t xml:space="preserve">Final evaluation differs slightly from project proposal, but a </w:t>
+      </w:r>
+      <w:r>
+        <w:rPr>
+          <w:rFonts w:ascii="Times New Roman" w:hAnsi="Times New Roman" w:cs="Times New Roman"/>
+        </w:rPr>
+        <w:t xml:space="preserve">PR </w:t>
+      </w:r>
+      <w:r>
+        <w:rPr>
+          <w:rFonts w:ascii="Times New Roman" w:hAnsi="Times New Roman" w:cs="Times New Roman"/>
+        </w:rPr>
+        <w:t xml:space="preserve">was still submitted to the Blobscan </w:t>
+      </w:r>
+      <w:r>
+        <w:rPr>
+          <w:rFonts w:ascii="Times New Roman" w:hAnsi="Times New Roman" w:cs="Times New Roman"/>
+        </w:rPr>
+        <w:t>GitHub repository.</w:t>
+      </w:r>
+    </w:p>
+    <w:p>
+      <w:pPr>
         <w:pStyle w:val="Heading1"/>
         <w:rPr>
           <w:rFonts w:ascii="Times New Roman" w:hAnsi="Times New Roman" w:cs="Times New Roman"/>
@@ -1493,74 +2475,10 @@
     </w:p>
     <w:p>
       <w:pPr>
-        <w:rPr>
-          <w:rFonts w:ascii="Times New Roman" w:hAnsi="Times New Roman" w:cs="Times New Roman"/>
-        </w:rPr>
-      </w:pPr>
-      <w:hyperlink r:id="rId19" w:history="1">
-        <w:r>
-          <w:rPr>
-            <w:rStyle w:val="Hyperlink"/>
-            <w:rFonts w:ascii="Times New Roman" w:hAnsi="Times New Roman" w:cs="Times New Roman"/>
-          </w:rPr>
-          <w:t>https://eips.ethereum.org/EIPS/eip-4844</w:t>
-        </w:r>
-      </w:hyperlink>
-    </w:p>
-    <w:p>
-      <w:pPr>
-        <w:rPr>
-          <w:rFonts w:ascii="Times New Roman" w:hAnsi="Times New Roman" w:cs="Times New Roman"/>
-        </w:rPr>
-      </w:pPr>
-    </w:p>
-    <w:p>
-      <w:pPr>
-        <w:rPr>
-          <w:rFonts w:ascii="Times New Roman" w:hAnsi="Times New Roman" w:cs="Times New Roman"/>
-        </w:rPr>
-      </w:pPr>
-      <w:r>
-        <w:rPr>
-          <w:rFonts w:ascii="Times New Roman" w:hAnsi="Times New Roman" w:cs="Times New Roman"/>
-        </w:rPr>
-        <w:br w:type="page"/>
-      </w:r>
-    </w:p>
-    <w:p>
-      <w:pPr>
-        <w:rPr>
-          <w:rFonts w:ascii="Times New Roman" w:hAnsi="Times New Roman" w:cs="Times New Roman"/>
-        </w:rPr>
-      </w:pPr>
-      <w:r>
-        <w:rPr>
-          <w:rFonts w:ascii="Times New Roman" w:hAnsi="Times New Roman" w:cs="Times New Roman"/>
-        </w:rPr>
-        <w:lastRenderedPageBreak/>
-        <w:t>Final Project Grading Rubric (90 points)</w:t>
-      </w:r>
-    </w:p>
-    <w:p>
-      <w:pPr>
-        <w:rPr>
-          <w:rFonts w:ascii="Times New Roman" w:hAnsi="Times New Roman" w:cs="Times New Roman"/>
-        </w:rPr>
-      </w:pPr>
-      <w:r>
-        <w:rPr>
-          <w:rFonts w:ascii="Times New Roman" w:hAnsi="Times New Roman" w:cs="Times New Roman"/>
-          <w:b/>
-          <w:bCs/>
-        </w:rPr>
-        <w:t>1. Technical Implementation &amp; Contribution Quality (25 pts)</w:t>
-      </w:r>
-    </w:p>
-    <w:p>
-      <w:pPr>
+        <w:pStyle w:val="ListParagraph"/>
         <w:numPr>
           <w:ilvl w:val="0"/>
-          <w:numId w:val="1"/>
+          <w:numId w:val="9"/>
         </w:numPr>
         <w:rPr>
           <w:rFonts w:ascii="Times New Roman" w:hAnsi="Times New Roman" w:cs="Times New Roman"/>
@@ -1570,419 +2488,61 @@
         <w:rPr>
           <w:rFonts w:ascii="Times New Roman" w:hAnsi="Times New Roman" w:cs="Times New Roman"/>
         </w:rPr>
-        <w:t>Correctness and functionality: the contribution works as intended and proposed objectives are fully implemented (10)</w:t>
-      </w:r>
-    </w:p>
-    <w:p>
-      <w:pPr>
-        <w:numPr>
-          <w:ilvl w:val="0"/>
-          <w:numId w:val="1"/>
-        </w:numPr>
-        <w:rPr>
-          <w:rFonts w:ascii="Times New Roman" w:hAnsi="Times New Roman" w:cs="Times New Roman"/>
-        </w:rPr>
-      </w:pPr>
-      <w:r>
-        <w:rPr>
-          <w:rFonts w:ascii="Times New Roman" w:hAnsi="Times New Roman" w:cs="Times New Roman"/>
-        </w:rPr>
-        <w:t>Depth and originality: non-trivial work that goes meaningfully beyond boilerplate; reflects genuine engagement with the target codebase (8)</w:t>
-      </w:r>
-    </w:p>
-    <w:p>
-      <w:pPr>
-        <w:numPr>
-          <w:ilvl w:val="0"/>
-          <w:numId w:val="1"/>
-        </w:numPr>
-        <w:rPr>
-          <w:rFonts w:ascii="Times New Roman" w:hAnsi="Times New Roman" w:cs="Times New Roman"/>
-        </w:rPr>
-      </w:pPr>
-      <w:r>
-        <w:rPr>
-          <w:rFonts w:ascii="Times New Roman" w:hAnsi="Times New Roman" w:cs="Times New Roman"/>
-        </w:rPr>
-        <w:t>Code quality: logical structure, readable style, appropriate comments, adherence to the upstream project's conventions (4)</w:t>
-      </w:r>
-    </w:p>
-    <w:p>
-      <w:pPr>
-        <w:numPr>
-          <w:ilvl w:val="0"/>
-          <w:numId w:val="1"/>
-        </w:numPr>
-        <w:rPr>
-          <w:rFonts w:ascii="Times New Roman" w:hAnsi="Times New Roman" w:cs="Times New Roman"/>
-        </w:rPr>
-      </w:pPr>
-      <w:r>
-        <w:rPr>
-          <w:rFonts w:ascii="Times New Roman" w:hAnsi="Times New Roman" w:cs="Times New Roman"/>
-        </w:rPr>
-        <w:t>Alignment with proposal: delivered work matches the contribution type committed to (bug fix, feature, tests, tooling, security, docs+code, or integration), or deviations are justified (3)</w:t>
-      </w:r>
-    </w:p>
-    <w:p>
-      <w:pPr>
-        <w:rPr>
-          <w:rFonts w:ascii="Times New Roman" w:hAnsi="Times New Roman" w:cs="Times New Roman"/>
-        </w:rPr>
-      </w:pPr>
-      <w:r>
-        <w:rPr>
-          <w:rFonts w:ascii="Times New Roman" w:hAnsi="Times New Roman" w:cs="Times New Roman"/>
-          <w:b/>
-          <w:bCs/>
-        </w:rPr>
-        <w:t>2. Engagement with the Open Source Project (15 pts)</w:t>
-      </w:r>
-    </w:p>
-    <w:p>
-      <w:pPr>
-        <w:numPr>
-          <w:ilvl w:val="0"/>
-          <w:numId w:val="2"/>
-        </w:numPr>
-        <w:rPr>
-          <w:rFonts w:ascii="Times New Roman" w:hAnsi="Times New Roman" w:cs="Times New Roman"/>
-        </w:rPr>
-      </w:pPr>
-      <w:r>
-        <w:rPr>
-          <w:rFonts w:ascii="Times New Roman" w:hAnsi="Times New Roman" w:cs="Times New Roman"/>
-        </w:rPr>
-        <w:t>Contribution-quality artifact produced: well-documented issue, tested implementation, meaningful pull request, or high-quality fork with clear upstream relevance (6)</w:t>
-      </w:r>
-    </w:p>
-    <w:p>
-      <w:pPr>
-        <w:numPr>
-          <w:ilvl w:val="0"/>
-          <w:numId w:val="2"/>
-        </w:numPr>
-        <w:rPr>
-          <w:rFonts w:ascii="Times New Roman" w:hAnsi="Times New Roman" w:cs="Times New Roman"/>
-        </w:rPr>
-      </w:pPr>
-      <w:r>
-        <w:rPr>
-          <w:rFonts w:ascii="Times New Roman" w:hAnsi="Times New Roman" w:cs="Times New Roman"/>
-        </w:rPr>
-        <w:t>Adherence to the upstream project's contribution guidelines, style, and review norms (4)</w:t>
-      </w:r>
-    </w:p>
-    <w:p>
-      <w:pPr>
-        <w:numPr>
-          <w:ilvl w:val="0"/>
-          <w:numId w:val="2"/>
-        </w:numPr>
-        <w:rPr>
-          <w:rFonts w:ascii="Times New Roman" w:hAnsi="Times New Roman" w:cs="Times New Roman"/>
-        </w:rPr>
-      </w:pPr>
-      <w:r>
-        <w:rPr>
-          <w:rFonts w:ascii="Times New Roman" w:hAnsi="Times New Roman" w:cs="Times New Roman"/>
-        </w:rPr>
-        <w:t>Evidence of real interaction with the codebase: issue discussion, draft PR, maintainer feedback, or detailed write-up of why upstreaming is or is not yet feasible (5)</w:t>
-      </w:r>
-    </w:p>
-    <w:p>
-      <w:pPr>
-        <w:rPr>
-          <w:rFonts w:ascii="Times New Roman" w:hAnsi="Times New Roman" w:cs="Times New Roman"/>
-        </w:rPr>
-      </w:pPr>
-      <w:r>
-        <w:rPr>
-          <w:rFonts w:ascii="Times New Roman" w:hAnsi="Times New Roman" w:cs="Times New Roman"/>
-          <w:b/>
-          <w:bCs/>
-        </w:rPr>
-        <w:t>3. Evaluation &amp; Validation (15 pts)</w:t>
-      </w:r>
-    </w:p>
-    <w:p>
-      <w:pPr>
-        <w:numPr>
-          <w:ilvl w:val="0"/>
-          <w:numId w:val="3"/>
-        </w:numPr>
-        <w:rPr>
-          <w:rFonts w:ascii="Times New Roman" w:hAnsi="Times New Roman" w:cs="Times New Roman"/>
-        </w:rPr>
-      </w:pPr>
-      <w:r>
-        <w:rPr>
-          <w:rFonts w:ascii="Times New Roman" w:hAnsi="Times New Roman" w:cs="Times New Roman"/>
-        </w:rPr>
-        <w:t>Concrete evidence the work functions: unit or integration tests, reproducible local setup, testnet deployment where applicable (7)</w:t>
-      </w:r>
-    </w:p>
-    <w:p>
-      <w:pPr>
-        <w:numPr>
-          <w:ilvl w:val="0"/>
-          <w:numId w:val="3"/>
-        </w:numPr>
-        <w:rPr>
-          <w:rFonts w:ascii="Times New Roman" w:hAnsi="Times New Roman" w:cs="Times New Roman"/>
-        </w:rPr>
-      </w:pPr>
-      <w:r>
-        <w:rPr>
-          <w:rFonts w:ascii="Times New Roman" w:hAnsi="Times New Roman" w:cs="Times New Roman"/>
-        </w:rPr>
-        <w:t>Quantitative or qualitative results: transaction traces, gas measurements, benchmarks, before/after comparisons, screenshots, or logs (5)</w:t>
-      </w:r>
-    </w:p>
-    <w:p>
-      <w:pPr>
-        <w:numPr>
-          <w:ilvl w:val="0"/>
-          <w:numId w:val="3"/>
-        </w:numPr>
-        <w:rPr>
-          <w:rFonts w:ascii="Times New Roman" w:hAnsi="Times New Roman" w:cs="Times New Roman"/>
-        </w:rPr>
-      </w:pPr>
-      <w:r>
-        <w:rPr>
-          <w:rFonts w:ascii="Times New Roman" w:hAnsi="Times New Roman" w:cs="Times New Roman"/>
-        </w:rPr>
-        <w:t>Evaluation matches what the proposal committed to, with explanation for any deviation (3)</w:t>
-      </w:r>
-    </w:p>
-    <w:p>
-      <w:pPr>
-        <w:rPr>
-          <w:rFonts w:ascii="Times New Roman" w:hAnsi="Times New Roman" w:cs="Times New Roman"/>
-        </w:rPr>
-      </w:pPr>
-      <w:r>
-        <w:rPr>
-          <w:rFonts w:ascii="Times New Roman" w:hAnsi="Times New Roman" w:cs="Times New Roman"/>
-          <w:b/>
-          <w:bCs/>
-        </w:rPr>
-        <w:t>4. Final Report (15 pts)</w:t>
-      </w:r>
-    </w:p>
-    <w:p>
-      <w:pPr>
-        <w:numPr>
-          <w:ilvl w:val="0"/>
-          <w:numId w:val="4"/>
-        </w:numPr>
-        <w:rPr>
-          <w:rFonts w:ascii="Times New Roman" w:hAnsi="Times New Roman" w:cs="Times New Roman"/>
-        </w:rPr>
-      </w:pPr>
-      <w:r>
-        <w:rPr>
-          <w:rFonts w:ascii="Times New Roman" w:hAnsi="Times New Roman" w:cs="Times New Roman"/>
-        </w:rPr>
-        <w:t>Organization and readability: introduction, background, methodology, results, conclusion flow logically; up to 10 pages, PDF or DOCX, with public GitHub repo URL at the start (5)</w:t>
-      </w:r>
-    </w:p>
-    <w:p>
-      <w:pPr>
-        <w:numPr>
-          <w:ilvl w:val="0"/>
-          <w:numId w:val="4"/>
-        </w:numPr>
-        <w:rPr>
-          <w:rFonts w:ascii="Times New Roman" w:hAnsi="Times New Roman" w:cs="Times New Roman"/>
-        </w:rPr>
-      </w:pPr>
-      <w:r>
-        <w:rPr>
-          <w:rFonts w:ascii="Times New Roman" w:hAnsi="Times New Roman" w:cs="Times New Roman"/>
-        </w:rPr>
-        <w:t>Depth and accuracy: tools, frameworks, and methodology clearly explained; results presented with charts, data, or analysis where appropriate (6)</w:t>
-      </w:r>
-    </w:p>
-    <w:p>
-      <w:pPr>
-        <w:numPr>
-          <w:ilvl w:val="0"/>
-          <w:numId w:val="4"/>
-        </w:numPr>
-        <w:rPr>
-          <w:rFonts w:ascii="Times New Roman" w:hAnsi="Times New Roman" w:cs="Times New Roman"/>
-        </w:rPr>
-      </w:pPr>
-      <w:r>
-        <w:rPr>
-          <w:rFonts w:ascii="Times New Roman" w:hAnsi="Times New Roman" w:cs="Times New Roman"/>
-        </w:rPr>
-        <w:t>Citations and references to relevant prior work, documentation, and the upstream project (4)</w:t>
-      </w:r>
-    </w:p>
-    <w:p>
-      <w:pPr>
-        <w:rPr>
-          <w:rFonts w:ascii="Times New Roman" w:hAnsi="Times New Roman" w:cs="Times New Roman"/>
-        </w:rPr>
-      </w:pPr>
-      <w:r>
-        <w:rPr>
-          <w:rFonts w:ascii="Times New Roman" w:hAnsi="Times New Roman" w:cs="Times New Roman"/>
-          <w:b/>
-          <w:bCs/>
-        </w:rPr>
-        <w:lastRenderedPageBreak/>
-        <w:t>5. GitHub Activity &amp; Repository Organization (10 pts)</w:t>
-      </w:r>
-    </w:p>
-    <w:p>
-      <w:pPr>
-        <w:numPr>
-          <w:ilvl w:val="0"/>
-          <w:numId w:val="5"/>
-        </w:numPr>
-        <w:rPr>
-          <w:rFonts w:ascii="Times New Roman" w:hAnsi="Times New Roman" w:cs="Times New Roman"/>
-        </w:rPr>
-      </w:pPr>
-      <w:r>
-        <w:rPr>
-          <w:rFonts w:ascii="Times New Roman" w:hAnsi="Times New Roman" w:cs="Times New Roman"/>
-        </w:rPr>
-        <w:t>Commit regularity and quality: frequent commits across the 3-week window with meaningful messages, showing progressive work rather than a single end-of-term dump (6)</w:t>
-      </w:r>
-    </w:p>
-    <w:p>
-      <w:pPr>
-        <w:numPr>
-          <w:ilvl w:val="0"/>
-          <w:numId w:val="5"/>
-        </w:numPr>
-        <w:rPr>
-          <w:rFonts w:ascii="Times New Roman" w:hAnsi="Times New Roman" w:cs="Times New Roman"/>
-        </w:rPr>
-      </w:pPr>
-      <w:r>
-        <w:rPr>
-          <w:rFonts w:ascii="Times New Roman" w:hAnsi="Times New Roman" w:cs="Times New Roman"/>
-        </w:rPr>
-        <w:t>Repository organization: public repo with clear README, folder structure, and instructions to build, run, and test (4)</w:t>
-      </w:r>
-    </w:p>
-    <w:p>
-      <w:pPr>
-        <w:rPr>
-          <w:rFonts w:ascii="Times New Roman" w:hAnsi="Times New Roman" w:cs="Times New Roman"/>
-        </w:rPr>
-      </w:pPr>
-      <w:r>
-        <w:rPr>
-          <w:rFonts w:ascii="Times New Roman" w:hAnsi="Times New Roman" w:cs="Times New Roman"/>
-          <w:b/>
-          <w:bCs/>
-        </w:rPr>
-        <w:t>6. Team Collaboration &amp; Contribution (5 pts)</w:t>
-      </w:r>
-    </w:p>
-    <w:p>
-      <w:pPr>
-        <w:numPr>
-          <w:ilvl w:val="0"/>
-          <w:numId w:val="6"/>
-        </w:numPr>
-        <w:rPr>
-          <w:rFonts w:ascii="Times New Roman" w:hAnsi="Times New Roman" w:cs="Times New Roman"/>
-        </w:rPr>
-      </w:pPr>
-      <w:r>
-        <w:rPr>
-          <w:rFonts w:ascii="Times New Roman" w:hAnsi="Times New Roman" w:cs="Times New Roman"/>
-        </w:rPr>
-        <w:t>Role definition: each member's contributions clearly listed for 2-person teams; clear scope and effort statement for solo students (3)</w:t>
-      </w:r>
-    </w:p>
-    <w:p>
-      <w:pPr>
-        <w:numPr>
-          <w:ilvl w:val="0"/>
-          <w:numId w:val="6"/>
-        </w:numPr>
-        <w:rPr>
-          <w:rFonts w:ascii="Times New Roman" w:hAnsi="Times New Roman" w:cs="Times New Roman"/>
-        </w:rPr>
-      </w:pPr>
-      <w:r>
-        <w:rPr>
-          <w:rFonts w:ascii="Times New Roman" w:hAnsi="Times New Roman" w:cs="Times New Roman"/>
-        </w:rPr>
-        <w:t>Evidence of coordination: shared commit history, issues, or write-up indicating effective collaboration (2)</w:t>
-      </w:r>
-    </w:p>
-    <w:p>
-      <w:pPr>
-        <w:rPr>
-          <w:rFonts w:ascii="Times New Roman" w:hAnsi="Times New Roman" w:cs="Times New Roman"/>
-        </w:rPr>
-      </w:pPr>
-      <w:r>
-        <w:rPr>
-          <w:rFonts w:ascii="Times New Roman" w:hAnsi="Times New Roman" w:cs="Times New Roman"/>
-          <w:b/>
-          <w:bCs/>
-        </w:rPr>
-        <w:t>7. Self-Recorded Video &amp; Presentation (5 pts)</w:t>
-      </w:r>
-    </w:p>
-    <w:p>
-      <w:pPr>
-        <w:numPr>
-          <w:ilvl w:val="0"/>
-          <w:numId w:val="7"/>
-        </w:numPr>
-        <w:rPr>
-          <w:rFonts w:ascii="Times New Roman" w:hAnsi="Times New Roman" w:cs="Times New Roman"/>
-        </w:rPr>
-      </w:pPr>
-      <w:r>
-        <w:rPr>
-          <w:rFonts w:ascii="Times New Roman" w:hAnsi="Times New Roman" w:cs="Times New Roman"/>
-        </w:rPr>
-        <w:t>Approximately 5 minutes, linked in the report; covers goals, approach, key features, and a demo of the working contribution (3)</w:t>
-      </w:r>
-    </w:p>
-    <w:p>
-      <w:pPr>
-        <w:numPr>
-          <w:ilvl w:val="0"/>
-          <w:numId w:val="7"/>
-        </w:numPr>
-        <w:rPr>
-          <w:rFonts w:ascii="Times New Roman" w:hAnsi="Times New Roman" w:cs="Times New Roman"/>
-        </w:rPr>
-      </w:pPr>
-      <w:r>
-        <w:rPr>
-          <w:rFonts w:ascii="Times New Roman" w:hAnsi="Times New Roman" w:cs="Times New Roman"/>
-        </w:rPr>
-        <w:t>Clear delivery with acceptable audio and video quality (2)</w:t>
-      </w:r>
-    </w:p>
-    <w:p>
-      <w:pPr>
-        <w:rPr>
-          <w:rFonts w:ascii="Times New Roman" w:hAnsi="Times New Roman" w:cs="Times New Roman"/>
-        </w:rPr>
-      </w:pPr>
-      <w:r>
-        <w:rPr>
-          <w:rFonts w:ascii="Times New Roman" w:hAnsi="Times New Roman" w:cs="Times New Roman"/>
-          <w:b/>
-          <w:bCs/>
-        </w:rPr>
-        <w:t>Total: 90 points</w:t>
+        <w:t>Vitalik Buterin</w:t>
+      </w:r>
+      <w:r>
+        <w:rPr>
+          <w:rFonts w:ascii="Times New Roman" w:hAnsi="Times New Roman" w:cs="Times New Roman"/>
+        </w:rPr>
+        <w:t xml:space="preserve">, </w:t>
+      </w:r>
+      <w:r>
+        <w:rPr>
+          <w:rFonts w:ascii="Times New Roman" w:hAnsi="Times New Roman" w:cs="Times New Roman"/>
+        </w:rPr>
+        <w:t xml:space="preserve">Dankrad Feist, Diederik Loerakker, George Kadianakis, Matt Garnett, </w:t>
+      </w:r>
+      <w:proofErr w:type="spellStart"/>
+      <w:r>
+        <w:rPr>
+          <w:rFonts w:ascii="Times New Roman" w:hAnsi="Times New Roman" w:cs="Times New Roman"/>
+        </w:rPr>
+        <w:t>Mofi</w:t>
+      </w:r>
+      <w:proofErr w:type="spellEnd"/>
+      <w:r>
+        <w:rPr>
+          <w:rFonts w:ascii="Times New Roman" w:hAnsi="Times New Roman" w:cs="Times New Roman"/>
+        </w:rPr>
+        <w:t xml:space="preserve"> Taiwo, Ansgar </w:t>
+      </w:r>
+      <w:proofErr w:type="spellStart"/>
+      <w:r>
+        <w:rPr>
+          <w:rFonts w:ascii="Times New Roman" w:hAnsi="Times New Roman" w:cs="Times New Roman"/>
+        </w:rPr>
+        <w:t>Dietrichs</w:t>
+      </w:r>
+      <w:proofErr w:type="spellEnd"/>
+      <w:r>
+        <w:rPr>
+          <w:rFonts w:ascii="Times New Roman" w:hAnsi="Times New Roman" w:cs="Times New Roman"/>
+        </w:rPr>
+        <w:t>, "EIP-4844: Shard Blob Transactions," </w:t>
+      </w:r>
+      <w:r>
+        <w:rPr>
+          <w:rFonts w:ascii="Times New Roman" w:hAnsi="Times New Roman" w:cs="Times New Roman"/>
+          <w:i/>
+          <w:iCs/>
+        </w:rPr>
+        <w:t>Ethereum Improvement Proposals</w:t>
+      </w:r>
+      <w:r>
+        <w:rPr>
+          <w:rFonts w:ascii="Times New Roman" w:hAnsi="Times New Roman" w:cs="Times New Roman"/>
+        </w:rPr>
+        <w:t>, no. 4844, February 2022. Available: https://eips.ethereum.org/EIPS/eip-4844.</w:t>
       </w:r>
     </w:p>
     <w:p>
@@ -3098,6 +3658,95 @@
     </w:lvl>
   </w:abstractNum>
   <w:abstractNum w:abstractNumId="7" w15:restartNumberingAfterBreak="0">
+    <w:nsid w:val="520D72E9"/>
+    <w:multiLevelType w:val="hybridMultilevel"/>
+    <w:tmpl w:val="34588784"/>
+    <w:lvl w:ilvl="0" w:tplc="0409000F">
+      <w:start w:val="1"/>
+      <w:numFmt w:val="decimal"/>
+      <w:lvlText w:val="%1."/>
+      <w:lvlJc w:val="left"/>
+      <w:pPr>
+        <w:ind w:left="720" w:hanging="360"/>
+      </w:pPr>
+      <w:rPr>
+        <w:rFonts w:hint="default"/>
+      </w:rPr>
+    </w:lvl>
+    <w:lvl w:ilvl="1" w:tplc="04090019" w:tentative="1">
+      <w:start w:val="1"/>
+      <w:numFmt w:val="lowerLetter"/>
+      <w:lvlText w:val="%2."/>
+      <w:lvlJc w:val="left"/>
+      <w:pPr>
+        <w:ind w:left="1440" w:hanging="360"/>
+      </w:pPr>
+    </w:lvl>
+    <w:lvl w:ilvl="2" w:tplc="0409001B" w:tentative="1">
+      <w:start w:val="1"/>
+      <w:numFmt w:val="lowerRoman"/>
+      <w:lvlText w:val="%3."/>
+      <w:lvlJc w:val="right"/>
+      <w:pPr>
+        <w:ind w:left="2160" w:hanging="180"/>
+      </w:pPr>
+    </w:lvl>
+    <w:lvl w:ilvl="3" w:tplc="0409000F" w:tentative="1">
+      <w:start w:val="1"/>
+      <w:numFmt w:val="decimal"/>
+      <w:lvlText w:val="%4."/>
+      <w:lvlJc w:val="left"/>
+      <w:pPr>
+        <w:ind w:left="2880" w:hanging="360"/>
+      </w:pPr>
+    </w:lvl>
+    <w:lvl w:ilvl="4" w:tplc="04090019" w:tentative="1">
+      <w:start w:val="1"/>
+      <w:numFmt w:val="lowerLetter"/>
+      <w:lvlText w:val="%5."/>
+      <w:lvlJc w:val="left"/>
+      <w:pPr>
+        <w:ind w:left="3600" w:hanging="360"/>
+      </w:pPr>
+    </w:lvl>
+    <w:lvl w:ilvl="5" w:tplc="0409001B" w:tentative="1">
+      <w:start w:val="1"/>
+      <w:numFmt w:val="lowerRoman"/>
+      <w:lvlText w:val="%6."/>
+      <w:lvlJc w:val="right"/>
+      <w:pPr>
+        <w:ind w:left="4320" w:hanging="180"/>
+      </w:pPr>
+    </w:lvl>
+    <w:lvl w:ilvl="6" w:tplc="0409000F" w:tentative="1">
+      <w:start w:val="1"/>
+      <w:numFmt w:val="decimal"/>
+      <w:lvlText w:val="%7."/>
+      <w:lvlJc w:val="left"/>
+      <w:pPr>
+        <w:ind w:left="5040" w:hanging="360"/>
+      </w:pPr>
+    </w:lvl>
+    <w:lvl w:ilvl="7" w:tplc="04090019" w:tentative="1">
+      <w:start w:val="1"/>
+      <w:numFmt w:val="lowerLetter"/>
+      <w:lvlText w:val="%8."/>
+      <w:lvlJc w:val="left"/>
+      <w:pPr>
+        <w:ind w:left="5760" w:hanging="360"/>
+      </w:pPr>
+    </w:lvl>
+    <w:lvl w:ilvl="8" w:tplc="0409001B" w:tentative="1">
+      <w:start w:val="1"/>
+      <w:numFmt w:val="lowerRoman"/>
+      <w:lvlText w:val="%9."/>
+      <w:lvlJc w:val="right"/>
+      <w:pPr>
+        <w:ind w:left="6480" w:hanging="180"/>
+      </w:pPr>
+    </w:lvl>
+  </w:abstractNum>
+  <w:abstractNum w:abstractNumId="8" w15:restartNumberingAfterBreak="0">
     <w:nsid w:val="69A82F8A"/>
     <w:multiLevelType w:val="multilevel"/>
     <w:tmpl w:val="1026CD5E"/>
@@ -3250,7 +3899,7 @@
     <w:abstractNumId w:val="1"/>
   </w:num>
   <w:num w:numId="2" w16cid:durableId="454252203">
-    <w:abstractNumId w:val="7"/>
+    <w:abstractNumId w:val="8"/>
   </w:num>
   <w:num w:numId="3" w16cid:durableId="316107780">
     <w:abstractNumId w:val="3"/>
@@ -3269,6 +3918,9 @@
   </w:num>
   <w:num w:numId="8" w16cid:durableId="2142453507">
     <w:abstractNumId w:val="2"/>
+  </w:num>
+  <w:num w:numId="9" w16cid:durableId="1624651329">
+    <w:abstractNumId w:val="7"/>
   </w:num>
 </w:numbering>
 </file>
@@ -3702,7 +4354,6 @@
     <w:next w:val="Normal"/>
     <w:link w:val="Heading2Char"/>
     <w:uiPriority w:val="9"/>
-    <w:semiHidden/>
     <w:unhideWhenUsed/>
     <w:qFormat/>
     <w:rsid w:val="002A79A2"/>
@@ -3725,7 +4376,6 @@
     <w:next w:val="Normal"/>
     <w:link w:val="Heading3Char"/>
     <w:uiPriority w:val="9"/>
-    <w:semiHidden/>
     <w:unhideWhenUsed/>
     <w:qFormat/>
     <w:rsid w:val="002A79A2"/>
@@ -3877,7 +4527,6 @@
   <w:style w:type="character" w:default="1" w:styleId="DefaultParagraphFont">
     <w:name w:val="Default Paragraph Font"/>
     <w:uiPriority w:val="1"/>
-    <w:semiHidden/>
     <w:unhideWhenUsed/>
   </w:style>
   <w:style w:type="table" w:default="1" w:styleId="TableNormal">
@@ -3919,7 +4568,6 @@
     <w:basedOn w:val="DefaultParagraphFont"/>
     <w:link w:val="Heading2"/>
     <w:uiPriority w:val="9"/>
-    <w:semiHidden/>
     <w:rsid w:val="002A79A2"/>
     <w:rPr>
       <w:rFonts w:asciiTheme="majorHAnsi" w:eastAsiaTheme="majorEastAsia" w:hAnsiTheme="majorHAnsi" w:cstheme="majorBidi"/>
@@ -3933,7 +4581,6 @@
     <w:basedOn w:val="DefaultParagraphFont"/>
     <w:link w:val="Heading3"/>
     <w:uiPriority w:val="9"/>
-    <w:semiHidden/>
     <w:rsid w:val="002A79A2"/>
     <w:rPr>
       <w:rFonts w:eastAsiaTheme="majorEastAsia" w:cstheme="majorBidi"/>
@@ -4258,6 +4905,18 @@
       <w:shd w:val="clear" w:color="auto" w:fill="E1DFDD"/>
     </w:rPr>
   </w:style>
+  <w:style w:type="character" w:styleId="FollowedHyperlink">
+    <w:name w:val="FollowedHyperlink"/>
+    <w:basedOn w:val="DefaultParagraphFont"/>
+    <w:uiPriority w:val="99"/>
+    <w:semiHidden/>
+    <w:unhideWhenUsed/>
+    <w:rsid w:val="003B0301"/>
+    <w:rPr>
+      <w:color w:val="96607D" w:themeColor="followedHyperlink"/>
+      <w:u w:val="single"/>
+    </w:rPr>
+  </w:style>
 </w:styles>
 </file>
 

</xml_diff>

<commit_message>
final report and report pdf
</commit_message>
<xml_diff>
--- a/ProjectReport.docx
+++ b/ProjectReport.docx
@@ -56,6 +56,15 @@
         </w:rPr>
         <w:t xml:space="preserve">GitHub PR Link: </w:t>
       </w:r>
+      <w:hyperlink r:id="rId8" w:history="1">
+        <w:r>
+          <w:rPr>
+            <w:rStyle w:val="Hyperlink"/>
+            <w:rFonts w:ascii="Times New Roman" w:hAnsi="Times New Roman" w:cs="Times New Roman"/>
+          </w:rPr>
+          <w:t>https://github.com/Blobscan/blobscan/pull/982</w:t>
+        </w:r>
+      </w:hyperlink>
     </w:p>
     <w:p>
       <w:pPr>
@@ -69,6 +78,15 @@
         </w:rPr>
         <w:t xml:space="preserve">YouTube Demo: </w:t>
       </w:r>
+      <w:hyperlink r:id="rId9" w:history="1">
+        <w:r>
+          <w:rPr>
+            <w:rStyle w:val="Hyperlink"/>
+            <w:rFonts w:ascii="Times New Roman" w:hAnsi="Times New Roman" w:cs="Times New Roman"/>
+          </w:rPr>
+          <w:t>https://youtu.be/9WzsHFktUIU</w:t>
+        </w:r>
+      </w:hyperlink>
     </w:p>
     <w:p>
       <w:pPr>
@@ -102,7 +120,7 @@
         </w:rPr>
         <w:t xml:space="preserve">Ignacio Yockers, 113498513, </w:t>
       </w:r>
-      <w:hyperlink r:id="rId8" w:history="1">
+      <w:hyperlink r:id="rId10" w:history="1">
         <w:r>
           <w:rPr>
             <w:rStyle w:val="Hyperlink"/>
@@ -127,6 +145,31 @@
     </w:p>
     <w:p>
       <w:pPr>
+        <w:rPr>
+          <w:rFonts w:ascii="Times New Roman" w:hAnsi="Times New Roman" w:cs="Times New Roman"/>
+        </w:rPr>
+      </w:pPr>
+    </w:p>
+    <w:p>
+      <w:pPr>
+        <w:jc w:val="center"/>
+        <w:rPr>
+          <w:rFonts w:ascii="Times New Roman" w:hAnsi="Times New Roman" w:cs="Times New Roman"/>
+          <w:sz w:val="44"/>
+          <w:szCs w:val="44"/>
+        </w:rPr>
+      </w:pPr>
+      <w:r>
+        <w:rPr>
+          <w:rFonts w:ascii="Times New Roman" w:hAnsi="Times New Roman" w:cs="Times New Roman"/>
+          <w:sz w:val="44"/>
+          <w:szCs w:val="44"/>
+        </w:rPr>
+        <w:t>Project Report</w:t>
+      </w:r>
+    </w:p>
+    <w:p>
+      <w:pPr>
         <w:pStyle w:val="Heading1"/>
         <w:rPr>
           <w:rFonts w:ascii="Times New Roman" w:hAnsi="Times New Roman" w:cs="Times New Roman"/>
@@ -318,7 +361,19 @@
         <w:rPr>
           <w:rFonts w:ascii="Times New Roman" w:hAnsi="Times New Roman" w:cs="Times New Roman"/>
         </w:rPr>
-        <w:t xml:space="preserve"> New API endpoints</w:t>
+        <w:t xml:space="preserve"> </w:t>
+      </w:r>
+      <w:r>
+        <w:rPr>
+          <w:rFonts w:ascii="Times New Roman" w:hAnsi="Times New Roman" w:cs="Times New Roman"/>
+        </w:rPr>
+        <w:t>n</w:t>
+      </w:r>
+      <w:r>
+        <w:rPr>
+          <w:rFonts w:ascii="Times New Roman" w:hAnsi="Times New Roman" w:cs="Times New Roman"/>
+        </w:rPr>
+        <w:t>ew API endpoints</w:t>
       </w:r>
       <w:r>
         <w:rPr>
@@ -500,7 +555,14 @@
         <w:rPr>
           <w:rFonts w:ascii="Times New Roman" w:hAnsi="Times New Roman" w:cs="Times New Roman"/>
         </w:rPr>
-        <w:t xml:space="preserve"> Additionally, Blobscan provides users with a public API that can be used to directly query information from the Blobscan database about </w:t>
+        <w:t xml:space="preserve"> Additionally, Blobscan provides users with a public API that can be used to directly query information from the Blobscan database </w:t>
+      </w:r>
+      <w:r>
+        <w:rPr>
+          <w:rFonts w:ascii="Times New Roman" w:hAnsi="Times New Roman" w:cs="Times New Roman"/>
+        </w:rPr>
+        <w:lastRenderedPageBreak/>
+        <w:t xml:space="preserve">about </w:t>
       </w:r>
       <w:r>
         <w:rPr>
@@ -540,7 +602,6 @@
         <w:rPr>
           <w:rFonts w:ascii="Times New Roman" w:hAnsi="Times New Roman" w:cs="Times New Roman"/>
         </w:rPr>
-        <w:lastRenderedPageBreak/>
         <w:t>Methodology</w:t>
       </w:r>
       <w:r>
@@ -583,7 +644,7 @@
         </w:rPr>
         <w:t xml:space="preserve"> (</w:t>
       </w:r>
-      <w:hyperlink r:id="rId9" w:history="1">
+      <w:hyperlink r:id="rId11" w:history="1">
         <w:r>
           <w:rPr>
             <w:rStyle w:val="Hyperlink"/>
@@ -1087,6 +1148,7 @@
         <w:rPr>
           <w:rFonts w:ascii="Times New Roman" w:hAnsi="Times New Roman" w:cs="Times New Roman"/>
         </w:rPr>
+        <w:lastRenderedPageBreak/>
         <w:t>Gas</w:t>
       </w:r>
       <w:r>
@@ -1160,7 +1222,19 @@
         <w:rPr>
           <w:rFonts w:ascii="Times New Roman" w:hAnsi="Times New Roman" w:cs="Times New Roman"/>
         </w:rPr>
-        <w:t xml:space="preserve">the all-time average gas price, or the most recent day, week, </w:t>
+        <w:t xml:space="preserve">the all-time average gas price, or the </w:t>
+      </w:r>
+      <w:r>
+        <w:rPr>
+          <w:rFonts w:ascii="Times New Roman" w:hAnsi="Times New Roman" w:cs="Times New Roman"/>
+        </w:rPr>
+        <w:t xml:space="preserve">average gas price of the </w:t>
+      </w:r>
+      <w:r>
+        <w:rPr>
+          <w:rFonts w:ascii="Times New Roman" w:hAnsi="Times New Roman" w:cs="Times New Roman"/>
+        </w:rPr>
+        <w:t xml:space="preserve">most recent day, week, </w:t>
       </w:r>
       <w:r>
         <w:rPr>
@@ -1208,14 +1282,7 @@
         <w:rPr>
           <w:rFonts w:ascii="Times New Roman" w:hAnsi="Times New Roman" w:cs="Times New Roman"/>
         </w:rPr>
-        <w:t xml:space="preserve">a time </w:t>
-      </w:r>
-      <w:r>
-        <w:rPr>
-          <w:rFonts w:ascii="Times New Roman" w:hAnsi="Times New Roman" w:cs="Times New Roman"/>
-        </w:rPr>
-        <w:lastRenderedPageBreak/>
-        <w:t>range. This endpoint also returns the timestamps associated with the values returned. This way, the user can see the specific time the average gas price was calculated at.</w:t>
+        <w:t>a time range. This endpoint also returns the timestamps associated with the values returned. This way, the user can see the specific time the average gas price was calculated at.</w:t>
       </w:r>
     </w:p>
     <w:p>
@@ -1362,7 +1429,7 @@
                     <pic:cNvPicPr/>
                   </pic:nvPicPr>
                   <pic:blipFill>
-                    <a:blip r:embed="rId10"/>
+                    <a:blip r:embed="rId12"/>
                     <a:stretch>
                       <a:fillRect/>
                     </a:stretch>
@@ -1424,7 +1491,7 @@
                     <pic:cNvPicPr/>
                   </pic:nvPicPr>
                   <pic:blipFill>
-                    <a:blip r:embed="rId11"/>
+                    <a:blip r:embed="rId13"/>
                     <a:stretch>
                       <a:fillRect/>
                     </a:stretch>
@@ -1485,7 +1552,7 @@
                     <pic:cNvPicPr/>
                   </pic:nvPicPr>
                   <pic:blipFill>
-                    <a:blip r:embed="rId12"/>
+                    <a:blip r:embed="rId14"/>
                     <a:stretch>
                       <a:fillRect/>
                     </a:stretch>
@@ -1546,7 +1613,7 @@
                     <pic:cNvPicPr/>
                   </pic:nvPicPr>
                   <pic:blipFill>
-                    <a:blip r:embed="rId13"/>
+                    <a:blip r:embed="rId15"/>
                     <a:stretch>
                       <a:fillRect/>
                     </a:stretch>
@@ -1608,7 +1675,7 @@
                     <pic:cNvPicPr/>
                   </pic:nvPicPr>
                   <pic:blipFill>
-                    <a:blip r:embed="rId14"/>
+                    <a:blip r:embed="rId16"/>
                     <a:stretch>
                       <a:fillRect/>
                     </a:stretch>
@@ -1669,7 +1736,7 @@
                     <pic:cNvPicPr/>
                   </pic:nvPicPr>
                   <pic:blipFill>
-                    <a:blip r:embed="rId15"/>
+                    <a:blip r:embed="rId17"/>
                     <a:stretch>
                       <a:fillRect/>
                     </a:stretch>
@@ -1692,7 +1759,7 @@
     </w:p>
     <w:p>
       <w:pPr>
-        <w:ind w:firstLine="360"/>
+        <w:ind w:firstLine="720"/>
         <w:rPr>
           <w:rFonts w:ascii="Times New Roman" w:hAnsi="Times New Roman" w:cs="Times New Roman"/>
         </w:rPr>
@@ -1874,11 +1941,25 @@
     </w:p>
     <w:p>
       <w:pPr>
-        <w:ind w:left="360"/>
-        <w:rPr>
-          <w:rFonts w:ascii="Times New Roman" w:hAnsi="Times New Roman" w:cs="Times New Roman"/>
-        </w:rPr>
-      </w:pPr>
+        <w:tabs>
+          <w:tab w:val="left" w:pos="450"/>
+        </w:tabs>
+        <w:rPr>
+          <w:rFonts w:ascii="Times New Roman" w:hAnsi="Times New Roman" w:cs="Times New Roman"/>
+        </w:rPr>
+      </w:pPr>
+      <w:r>
+        <w:rPr>
+          <w:rFonts w:ascii="Times New Roman" w:hAnsi="Times New Roman" w:cs="Times New Roman"/>
+        </w:rPr>
+        <w:tab/>
+      </w:r>
+      <w:r>
+        <w:rPr>
+          <w:rFonts w:ascii="Times New Roman" w:hAnsi="Times New Roman" w:cs="Times New Roman"/>
+        </w:rPr>
+        <w:tab/>
+      </w:r>
       <w:r>
         <w:rPr>
           <w:rFonts w:ascii="Times New Roman" w:hAnsi="Times New Roman" w:cs="Times New Roman"/>
@@ -1907,7 +1988,21 @@
         <w:rPr>
           <w:rFonts w:ascii="Times New Roman" w:hAnsi="Times New Roman" w:cs="Times New Roman"/>
         </w:rPr>
-        <w:t>each added API endpoint can found within</w:t>
+        <w:t xml:space="preserve">each added API endpoint can </w:t>
+      </w:r>
+      <w:proofErr w:type="gramStart"/>
+      <w:r>
+        <w:rPr>
+          <w:rFonts w:ascii="Times New Roman" w:hAnsi="Times New Roman" w:cs="Times New Roman"/>
+        </w:rPr>
+        <w:t>found</w:t>
+      </w:r>
+      <w:proofErr w:type="gramEnd"/>
+      <w:r>
+        <w:rPr>
+          <w:rFonts w:ascii="Times New Roman" w:hAnsi="Times New Roman" w:cs="Times New Roman"/>
+        </w:rPr>
+        <w:t xml:space="preserve"> within</w:t>
       </w:r>
       <w:r>
         <w:rPr>
@@ -1933,7 +2028,13 @@
         <w:rPr>
           <w:rFonts w:ascii="Times New Roman" w:hAnsi="Times New Roman" w:cs="Times New Roman"/>
         </w:rPr>
-        <w:t xml:space="preserve"> The specific files added and their associated successful tests </w:t>
+        <w:t xml:space="preserve"> </w:t>
+      </w:r>
+      <w:r>
+        <w:rPr>
+          <w:rFonts w:ascii="Times New Roman" w:hAnsi="Times New Roman" w:cs="Times New Roman"/>
+        </w:rPr>
+        <w:t xml:space="preserve">The specific files added and their associated successful tests </w:t>
       </w:r>
       <w:r>
         <w:rPr>
@@ -1996,7 +2097,7 @@
                     <pic:cNvPicPr/>
                   </pic:nvPicPr>
                   <pic:blipFill>
-                    <a:blip r:embed="rId16"/>
+                    <a:blip r:embed="rId18"/>
                     <a:stretch>
                       <a:fillRect/>
                     </a:stretch>
@@ -2072,7 +2173,7 @@
                     <pic:cNvPicPr/>
                   </pic:nvPicPr>
                   <pic:blipFill>
-                    <a:blip r:embed="rId17"/>
+                    <a:blip r:embed="rId19"/>
                     <a:stretch>
                       <a:fillRect/>
                     </a:stretch>
@@ -2163,7 +2264,7 @@
                     <pic:cNvPicPr/>
                   </pic:nvPicPr>
                   <pic:blipFill>
-                    <a:blip r:embed="rId18"/>
+                    <a:blip r:embed="rId20"/>
                     <a:stretch>
                       <a:fillRect/>
                     </a:stretch>
@@ -2238,7 +2339,7 @@
                     <pic:cNvPicPr/>
                   </pic:nvPicPr>
                   <pic:blipFill>
-                    <a:blip r:embed="rId19"/>
+                    <a:blip r:embed="rId21"/>
                     <a:stretch>
                       <a:fillRect/>
                     </a:stretch>
@@ -2261,6 +2362,7 @@
     </w:p>
     <w:p>
       <w:pPr>
+        <w:ind w:firstLine="720"/>
         <w:rPr>
           <w:rFonts w:ascii="Times New Roman" w:hAnsi="Times New Roman" w:cs="Times New Roman"/>
         </w:rPr>
@@ -2348,6 +2450,7 @@
     </w:p>
     <w:p>
       <w:pPr>
+        <w:ind w:firstLine="720"/>
         <w:rPr>
           <w:rFonts w:ascii="Times New Roman" w:hAnsi="Times New Roman" w:cs="Times New Roman"/>
         </w:rPr>
@@ -2362,7 +2465,7 @@
         <w:rPr>
           <w:rFonts w:ascii="Times New Roman" w:hAnsi="Times New Roman" w:cs="Times New Roman"/>
         </w:rPr>
-        <w:t xml:space="preserve">Only the updated documentation and installation guides were included. </w:t>
+        <w:t xml:space="preserve">Only the updated documentation and installation guide were included. </w:t>
       </w:r>
       <w:r>
         <w:rPr>
@@ -2553,7 +2656,7 @@
       </w:pPr>
     </w:p>
     <w:sectPr>
-      <w:headerReference w:type="default" r:id="rId20"/>
+      <w:headerReference w:type="default" r:id="rId22"/>
       <w:pgSz w:w="12240" w:h="15840"/>
       <w:pgMar w:top="1440" w:right="1440" w:bottom="1440" w:left="1440" w:header="720" w:footer="720" w:gutter="0"/>
       <w:cols w:space="720"/>

</xml_diff>